<commit_message>
Game Logic class diagram done
</commit_message>
<xml_diff>
--- a/document/Szakdolgozat.docx
+++ b/document/Szakdolgozat.docx
@@ -5469,6 +5469,7 @@
         </w:rPr>
       </w:pPr>
       <w:proofErr w:type="spellStart"/>
+      <w:proofErr w:type="gramStart"/>
       <w:r>
         <w:rPr>
           <w:lang w:eastAsia="zh-CN"/>
@@ -5476,6 +5477,7 @@
         <w:t>SevenWonders.Game.Logic</w:t>
       </w:r>
       <w:proofErr w:type="spellEnd"/>
+      <w:proofErr w:type="gramEnd"/>
     </w:p>
     <w:p>
       <w:pPr>
@@ -5490,6 +5492,7 @@
         <w:t xml:space="preserve">A </w:t>
       </w:r>
       <w:proofErr w:type="spellStart"/>
+      <w:proofErr w:type="gramStart"/>
       <w:r>
         <w:rPr>
           <w:i/>
@@ -5499,6 +5502,7 @@
         <w:t>SevenWonders.Game.Logic</w:t>
       </w:r>
       <w:proofErr w:type="spellEnd"/>
+      <w:proofErr w:type="gramEnd"/>
       <w:r>
         <w:rPr>
           <w:lang w:eastAsia="zh-CN"/>
@@ -5528,6 +5532,7 @@
         </w:rPr>
       </w:pPr>
       <w:proofErr w:type="spellStart"/>
+      <w:proofErr w:type="gramStart"/>
       <w:r>
         <w:rPr>
           <w:lang w:eastAsia="zh-CN"/>
@@ -5535,6 +5540,7 @@
         <w:t>SevenWonders.Game.Engine</w:t>
       </w:r>
       <w:proofErr w:type="spellEnd"/>
+      <w:proofErr w:type="gramEnd"/>
     </w:p>
     <w:p>
       <w:pPr>
@@ -5549,6 +5555,7 @@
         <w:t xml:space="preserve">A </w:t>
       </w:r>
       <w:proofErr w:type="spellStart"/>
+      <w:proofErr w:type="gramStart"/>
       <w:r>
         <w:rPr>
           <w:i/>
@@ -5558,6 +5565,7 @@
         <w:t>SevenWonders.Game.Engine</w:t>
       </w:r>
       <w:proofErr w:type="spellEnd"/>
+      <w:proofErr w:type="gramEnd"/>
       <w:r>
         <w:rPr>
           <w:lang w:eastAsia="zh-CN"/>
@@ -5587,6 +5595,7 @@
         </w:rPr>
       </w:pPr>
       <w:proofErr w:type="spellStart"/>
+      <w:proofErr w:type="gramStart"/>
       <w:r>
         <w:rPr>
           <w:lang w:eastAsia="zh-CN"/>
@@ -5594,6 +5603,7 @@
         <w:t>SevenWonders.Game.Presenter</w:t>
       </w:r>
       <w:proofErr w:type="spellEnd"/>
+      <w:proofErr w:type="gramEnd"/>
     </w:p>
     <w:p>
       <w:pPr>
@@ -5608,6 +5618,7 @@
         <w:t xml:space="preserve">A </w:t>
       </w:r>
       <w:proofErr w:type="spellStart"/>
+      <w:proofErr w:type="gramStart"/>
       <w:r>
         <w:rPr>
           <w:i/>
@@ -5617,6 +5628,7 @@
         <w:t>SevenWonders.Game.Presenter</w:t>
       </w:r>
       <w:proofErr w:type="spellEnd"/>
+      <w:proofErr w:type="gramEnd"/>
       <w:r>
         <w:rPr>
           <w:lang w:eastAsia="zh-CN"/>
@@ -5703,6 +5715,7 @@
         </w:rPr>
       </w:pPr>
       <w:proofErr w:type="spellStart"/>
+      <w:proofErr w:type="gramStart"/>
       <w:r>
         <w:rPr>
           <w:lang w:eastAsia="zh-CN"/>
@@ -5710,6 +5723,7 @@
         <w:t>SevenWonders.Game.Scene.Editor</w:t>
       </w:r>
       <w:proofErr w:type="spellEnd"/>
+      <w:proofErr w:type="gramEnd"/>
     </w:p>
     <w:p>
       <w:pPr>
@@ -5724,6 +5738,7 @@
         <w:t xml:space="preserve">A </w:t>
       </w:r>
       <w:proofErr w:type="spellStart"/>
+      <w:proofErr w:type="gramStart"/>
       <w:r>
         <w:rPr>
           <w:i/>
@@ -5733,6 +5748,7 @@
         <w:t>SevenWonders.Game.Scene.Editor</w:t>
       </w:r>
       <w:proofErr w:type="spellEnd"/>
+      <w:proofErr w:type="gramEnd"/>
       <w:r>
         <w:rPr>
           <w:lang w:eastAsia="zh-CN"/>
@@ -5777,6 +5793,7 @@
         </w:rPr>
       </w:pPr>
       <w:proofErr w:type="spellStart"/>
+      <w:proofErr w:type="gramStart"/>
       <w:r>
         <w:rPr>
           <w:lang w:eastAsia="zh-CN"/>
@@ -5784,6 +5801,7 @@
         <w:t>SevenWonders.Web.Client.Model</w:t>
       </w:r>
       <w:proofErr w:type="spellEnd"/>
+      <w:proofErr w:type="gramEnd"/>
     </w:p>
     <w:p>
       <w:pPr>
@@ -5798,6 +5816,7 @@
         <w:t xml:space="preserve">A </w:t>
       </w:r>
       <w:proofErr w:type="spellStart"/>
+      <w:proofErr w:type="gramStart"/>
       <w:r>
         <w:rPr>
           <w:i/>
@@ -5807,6 +5826,7 @@
         <w:t>SevenWonders.Web.Client.Model</w:t>
       </w:r>
       <w:proofErr w:type="spellEnd"/>
+      <w:proofErr w:type="gramEnd"/>
       <w:r>
         <w:rPr>
           <w:lang w:eastAsia="zh-CN"/>
@@ -5822,6 +5842,7 @@
         </w:rPr>
       </w:pPr>
       <w:proofErr w:type="spellStart"/>
+      <w:proofErr w:type="gramStart"/>
       <w:r>
         <w:rPr>
           <w:lang w:eastAsia="zh-CN"/>
@@ -5829,6 +5850,7 @@
         <w:t>SevenWonders.Web.Server</w:t>
       </w:r>
       <w:proofErr w:type="spellEnd"/>
+      <w:proofErr w:type="gramEnd"/>
     </w:p>
     <w:p>
       <w:pPr>
@@ -5843,6 +5865,7 @@
         <w:t xml:space="preserve">A </w:t>
       </w:r>
       <w:proofErr w:type="spellStart"/>
+      <w:proofErr w:type="gramStart"/>
       <w:r>
         <w:rPr>
           <w:i/>
@@ -5852,6 +5875,7 @@
         <w:t>SevenWonders.Web.Server</w:t>
       </w:r>
       <w:proofErr w:type="spellEnd"/>
+      <w:proofErr w:type="gramEnd"/>
       <w:r>
         <w:rPr>
           <w:lang w:eastAsia="zh-CN"/>
@@ -5909,6 +5933,7 @@
         </w:rPr>
       </w:pPr>
       <w:proofErr w:type="spellStart"/>
+      <w:proofErr w:type="gramStart"/>
       <w:r>
         <w:rPr>
           <w:lang w:eastAsia="zh-CN"/>
@@ -5916,6 +5941,7 @@
         <w:t>SevenWonders.Web.Server.Model</w:t>
       </w:r>
       <w:proofErr w:type="spellEnd"/>
+      <w:proofErr w:type="gramEnd"/>
     </w:p>
     <w:p>
       <w:pPr>
@@ -5930,6 +5956,7 @@
         <w:t xml:space="preserve">A </w:t>
       </w:r>
       <w:proofErr w:type="spellStart"/>
+      <w:proofErr w:type="gramStart"/>
       <w:r>
         <w:rPr>
           <w:i/>
@@ -5939,6 +5966,7 @@
         <w:t>SevenWonders.Web.Server.Model</w:t>
       </w:r>
       <w:proofErr w:type="spellEnd"/>
+      <w:proofErr w:type="gramEnd"/>
       <w:r>
         <w:rPr>
           <w:lang w:eastAsia="zh-CN"/>
@@ -5968,6 +5996,7 @@
         </w:rPr>
       </w:pPr>
       <w:proofErr w:type="spellStart"/>
+      <w:proofErr w:type="gramStart"/>
       <w:r>
         <w:rPr>
           <w:lang w:eastAsia="zh-CN"/>
@@ -5975,6 +6004,7 @@
         <w:t>SevenWonders.Web.Server.Contract</w:t>
       </w:r>
       <w:proofErr w:type="spellEnd"/>
+      <w:proofErr w:type="gramEnd"/>
     </w:p>
     <w:p>
       <w:pPr>
@@ -5989,6 +6019,7 @@
         <w:t xml:space="preserve">A </w:t>
       </w:r>
       <w:proofErr w:type="spellStart"/>
+      <w:proofErr w:type="gramStart"/>
       <w:r>
         <w:rPr>
           <w:i/>
@@ -5998,6 +6029,7 @@
         <w:t>SevenWonders.Web.Server.Contract</w:t>
       </w:r>
       <w:proofErr w:type="spellEnd"/>
+      <w:proofErr w:type="gramEnd"/>
       <w:r>
         <w:rPr>
           <w:lang w:eastAsia="zh-CN"/>
@@ -6163,6 +6195,7 @@
         </w:rPr>
       </w:pPr>
       <w:proofErr w:type="spellStart"/>
+      <w:proofErr w:type="gramStart"/>
       <w:r>
         <w:rPr>
           <w:lang w:eastAsia="zh-CN"/>
@@ -6170,6 +6203,7 @@
         <w:t>SevenWonders.AI.Trainer.Server</w:t>
       </w:r>
       <w:proofErr w:type="spellEnd"/>
+      <w:proofErr w:type="gramEnd"/>
     </w:p>
     <w:p>
       <w:pPr>
@@ -6187,6 +6221,7 @@
         <w:t xml:space="preserve">A </w:t>
       </w:r>
       <w:proofErr w:type="spellStart"/>
+      <w:proofErr w:type="gramStart"/>
       <w:r>
         <w:rPr>
           <w:lang w:eastAsia="zh-CN"/>
@@ -6194,6 +6229,7 @@
         <w:t>SevenWonders.AI.Trainer.Server</w:t>
       </w:r>
       <w:proofErr w:type="spellEnd"/>
+      <w:proofErr w:type="gramEnd"/>
       <w:r>
         <w:rPr>
           <w:lang w:eastAsia="zh-CN"/>
@@ -7705,7 +7741,21 @@
         <w:rPr>
           <w:lang w:eastAsia="zh-CN"/>
         </w:rPr>
-        <w:t xml:space="preserve">t. Az interfész implementációja külső komponensekben történik, így lehetőség van lokális játékos, szerveroldali játékos vagy kliens oldali, távoli játékos megvalósítására. Ennek köszönhetően a többjátékos mód támogatása különállóan valósítható meg, anélkül hogy a Game </w:t>
+        <w:t xml:space="preserve">t. Az interfész implementációja külső komponensekben történik, így lehetőség van lokális játékos, szerveroldali játékos vagy kliens oldali, távoli játékos megvalósítására. Ennek köszönhetően a többjátékos mód támogatása különállóan valósítható meg, </w:t>
+      </w:r>
+      <w:proofErr w:type="gramStart"/>
+      <w:r>
+        <w:rPr>
+          <w:lang w:eastAsia="zh-CN"/>
+        </w:rPr>
+        <w:t>anélkül</w:t>
+      </w:r>
+      <w:proofErr w:type="gramEnd"/>
+      <w:r>
+        <w:rPr>
+          <w:lang w:eastAsia="zh-CN"/>
+        </w:rPr>
+        <w:t xml:space="preserve"> hogy a Game </w:t>
       </w:r>
       <w:proofErr w:type="spellStart"/>
       <w:r>
@@ -8282,6 +8332,7 @@
         <w:t xml:space="preserve">A Web Server komponens implementációja a </w:t>
       </w:r>
       <w:proofErr w:type="spellStart"/>
+      <w:proofErr w:type="gramStart"/>
       <w:r>
         <w:rPr>
           <w:i/>
@@ -8291,6 +8342,7 @@
         <w:t>SevenWonders.Web.Server.Model</w:t>
       </w:r>
       <w:proofErr w:type="spellEnd"/>
+      <w:proofErr w:type="gramEnd"/>
       <w:r>
         <w:rPr>
           <w:lang w:eastAsia="zh-CN"/>
@@ -8298,6 +8350,7 @@
         <w:t xml:space="preserve"> és a </w:t>
       </w:r>
       <w:proofErr w:type="spellStart"/>
+      <w:proofErr w:type="gramStart"/>
       <w:r>
         <w:rPr>
           <w:i/>
@@ -8307,6 +8360,7 @@
         <w:t>SevenWonders.Web.Server</w:t>
       </w:r>
       <w:proofErr w:type="spellEnd"/>
+      <w:proofErr w:type="gramEnd"/>
       <w:r>
         <w:rPr>
           <w:lang w:eastAsia="zh-CN"/>
@@ -8342,6 +8396,7 @@
         <w:t xml:space="preserve">A </w:t>
       </w:r>
       <w:proofErr w:type="spellStart"/>
+      <w:proofErr w:type="gramStart"/>
       <w:r>
         <w:rPr>
           <w:i/>
@@ -8351,6 +8406,7 @@
         <w:t>SevenWonders.Web.Server</w:t>
       </w:r>
       <w:proofErr w:type="spellEnd"/>
+      <w:proofErr w:type="gramEnd"/>
       <w:r>
         <w:rPr>
           <w:lang w:eastAsia="zh-CN"/>
@@ -8469,6 +8525,7 @@
         <w:t xml:space="preserve"> jellegét. A felhasználói fiókok és jogosultságok kezelésére a </w:t>
       </w:r>
       <w:proofErr w:type="spellStart"/>
+      <w:proofErr w:type="gramStart"/>
       <w:r>
         <w:rPr>
           <w:lang w:eastAsia="zh-CN"/>
@@ -8476,6 +8533,7 @@
         <w:t>Microsoft.AspNetCore.Identity</w:t>
       </w:r>
       <w:proofErr w:type="spellEnd"/>
+      <w:proofErr w:type="gramEnd"/>
       <w:r>
         <w:rPr>
           <w:lang w:eastAsia="zh-CN"/>
@@ -8551,6 +8609,7 @@
         <w:t xml:space="preserve">A </w:t>
       </w:r>
       <w:proofErr w:type="spellStart"/>
+      <w:proofErr w:type="gramStart"/>
       <w:r>
         <w:rPr>
           <w:i/>
@@ -8560,6 +8619,7 @@
         <w:t>SevenWonders.Web.Server.Model</w:t>
       </w:r>
       <w:proofErr w:type="spellEnd"/>
+      <w:proofErr w:type="gramEnd"/>
       <w:r>
         <w:rPr>
           <w:lang w:eastAsia="zh-CN"/>
@@ -8935,6 +8995,7 @@
         <w:t xml:space="preserve"> komponens a mesterséges intelligencia modell betanításáért felel, és a </w:t>
       </w:r>
       <w:proofErr w:type="spellStart"/>
+      <w:proofErr w:type="gramStart"/>
       <w:r>
         <w:rPr>
           <w:i/>
@@ -8944,6 +9005,7 @@
         <w:t>SevenWonders.AI.Trainer.Server</w:t>
       </w:r>
       <w:proofErr w:type="spellEnd"/>
+      <w:proofErr w:type="gramEnd"/>
       <w:r>
         <w:rPr>
           <w:lang w:eastAsia="zh-CN"/>
@@ -9158,6 +9220,7 @@
         <w:t xml:space="preserve">A </w:t>
       </w:r>
       <w:proofErr w:type="spellStart"/>
+      <w:proofErr w:type="gramStart"/>
       <w:r>
         <w:rPr>
           <w:i/>
@@ -9167,6 +9230,7 @@
         <w:t>SevenWonders.AI.Trainer.Server</w:t>
       </w:r>
       <w:proofErr w:type="spellEnd"/>
+      <w:proofErr w:type="gramEnd"/>
       <w:r>
         <w:rPr>
           <w:lang w:eastAsia="zh-CN"/>
@@ -9484,7 +9548,21 @@
           <w:lang w:eastAsia="zh-CN"/>
         </w:rPr>
         <w:noBreakHyphen/>
-        <w:t>környezet rugalmasan módosítható, anélkül hogy a forráskód megváltoztatására lenne szükség.</w:t>
+        <w:t xml:space="preserve">környezet rugalmasan módosítható, </w:t>
+      </w:r>
+      <w:proofErr w:type="gramStart"/>
+      <w:r>
+        <w:rPr>
+          <w:lang w:eastAsia="zh-CN"/>
+        </w:rPr>
+        <w:t>anélkül</w:t>
+      </w:r>
+      <w:proofErr w:type="gramEnd"/>
+      <w:r>
+        <w:rPr>
+          <w:lang w:eastAsia="zh-CN"/>
+        </w:rPr>
+        <w:t xml:space="preserve"> hogy a forráskód megváltoztatására lenne szükség.</w:t>
       </w:r>
     </w:p>
     <w:p>
@@ -9559,6 +9637,1181 @@
     </w:p>
     <w:p>
       <w:pPr>
+        <w:pStyle w:val="Heading4"/>
+        <w:rPr>
+          <w:lang w:eastAsia="zh-CN"/>
+        </w:rPr>
+      </w:pPr>
+      <w:proofErr w:type="spellStart"/>
+      <w:proofErr w:type="gramStart"/>
+      <w:r>
+        <w:rPr>
+          <w:lang w:eastAsia="zh-CN"/>
+        </w:rPr>
+        <w:t>SevenWonders.Game.Logic</w:t>
+      </w:r>
+      <w:proofErr w:type="spellEnd"/>
+      <w:proofErr w:type="gramEnd"/>
+    </w:p>
+    <w:p>
+      <w:pPr>
+        <w:rPr>
+          <w:lang w:eastAsia="zh-CN"/>
+        </w:rPr>
+      </w:pPr>
+      <w:r>
+        <w:rPr>
+          <w:noProof/>
+          <w:lang w:eastAsia="zh-CN"/>
+        </w:rPr>
+        <w:drawing>
+          <wp:inline distT="0" distB="0" distL="0" distR="0" wp14:anchorId="1DBE44F5" wp14:editId="7F8E0E88">
+            <wp:extent cx="5753735" cy="3769995"/>
+            <wp:effectExtent l="0" t="0" r="0" b="1905"/>
+            <wp:docPr id="1515699053" name="Picture 1"/>
+            <wp:cNvGraphicFramePr>
+              <a:graphicFrameLocks xmlns:a="http://schemas.openxmlformats.org/drawingml/2006/main" noChangeAspect="1"/>
+            </wp:cNvGraphicFramePr>
+            <a:graphic xmlns:a="http://schemas.openxmlformats.org/drawingml/2006/main">
+              <a:graphicData uri="http://schemas.openxmlformats.org/drawingml/2006/picture">
+                <pic:pic xmlns:pic="http://schemas.openxmlformats.org/drawingml/2006/picture">
+                  <pic:nvPicPr>
+                    <pic:cNvPr id="0" name="Picture 1"/>
+                    <pic:cNvPicPr>
+                      <a:picLocks noChangeAspect="1" noChangeArrowheads="1"/>
+                    </pic:cNvPicPr>
+                  </pic:nvPicPr>
+                  <pic:blipFill>
+                    <a:blip r:embed="rId14">
+                      <a:extLst>
+                        <a:ext uri="{28A0092B-C50C-407E-A947-70E740481C1C}">
+                          <a14:useLocalDpi xmlns:a14="http://schemas.microsoft.com/office/drawing/2010/main" val="0"/>
+                        </a:ext>
+                      </a:extLst>
+                    </a:blip>
+                    <a:srcRect/>
+                    <a:stretch>
+                      <a:fillRect/>
+                    </a:stretch>
+                  </pic:blipFill>
+                  <pic:spPr bwMode="auto">
+                    <a:xfrm>
+                      <a:off x="0" y="0"/>
+                      <a:ext cx="5753735" cy="3769995"/>
+                    </a:xfrm>
+                    <a:prstGeom prst="rect">
+                      <a:avLst/>
+                    </a:prstGeom>
+                    <a:noFill/>
+                    <a:ln>
+                      <a:noFill/>
+                    </a:ln>
+                  </pic:spPr>
+                </pic:pic>
+              </a:graphicData>
+            </a:graphic>
+          </wp:inline>
+        </w:drawing>
+      </w:r>
+    </w:p>
+    <w:p>
+      <w:pPr>
+        <w:rPr>
+          <w:lang w:eastAsia="zh-CN"/>
+        </w:rPr>
+      </w:pPr>
+      <w:r>
+        <w:rPr>
+          <w:lang w:eastAsia="zh-CN"/>
+        </w:rPr>
+        <w:t xml:space="preserve">A fenti diagram a Game </w:t>
+      </w:r>
+      <w:proofErr w:type="spellStart"/>
+      <w:r>
+        <w:rPr>
+          <w:lang w:eastAsia="zh-CN"/>
+        </w:rPr>
+        <w:t>Logic</w:t>
+      </w:r>
+      <w:proofErr w:type="spellEnd"/>
+      <w:r>
+        <w:rPr>
+          <w:lang w:eastAsia="zh-CN"/>
+        </w:rPr>
+        <w:t xml:space="preserve"> projekt főbb osztályait mutatja be, amelyek a játékmenet magas szintű irányításáért felelősek. A Game osztály implementálja az </w:t>
+      </w:r>
+      <w:proofErr w:type="spellStart"/>
+      <w:r>
+        <w:rPr>
+          <w:lang w:eastAsia="zh-CN"/>
+        </w:rPr>
+        <w:t>IGame</w:t>
+      </w:r>
+      <w:proofErr w:type="spellEnd"/>
+      <w:r>
+        <w:rPr>
+          <w:lang w:eastAsia="zh-CN"/>
+        </w:rPr>
+        <w:t xml:space="preserve"> interfészt, és a játék teljes életciklusát kezeli, beleértve az inicializálást és a játékmenet futtatását. A játék állapotkezelése a </w:t>
+      </w:r>
+      <w:proofErr w:type="spellStart"/>
+      <w:r>
+        <w:rPr>
+          <w:lang w:eastAsia="zh-CN"/>
+        </w:rPr>
+        <w:t>State</w:t>
+      </w:r>
+      <w:proofErr w:type="spellEnd"/>
+      <w:r>
+        <w:rPr>
+          <w:lang w:eastAsia="zh-CN"/>
+        </w:rPr>
+        <w:t xml:space="preserve"> tervezési mintát követi: a Game osztály egy aktuális </w:t>
+      </w:r>
+      <w:proofErr w:type="spellStart"/>
+      <w:r>
+        <w:rPr>
+          <w:lang w:eastAsia="zh-CN"/>
+        </w:rPr>
+        <w:t>IGameState</w:t>
+      </w:r>
+      <w:proofErr w:type="spellEnd"/>
+      <w:r>
+        <w:rPr>
+          <w:lang w:eastAsia="zh-CN"/>
+        </w:rPr>
+        <w:t xml:space="preserve"> </w:t>
+      </w:r>
+      <w:r>
+        <w:rPr>
+          <w:lang w:eastAsia="zh-CN"/>
+        </w:rPr>
+        <w:lastRenderedPageBreak/>
+        <w:t xml:space="preserve">példányra hivatkozik, amely meghatározza az adott játékszakasz viselkedését. A </w:t>
+      </w:r>
+      <w:proofErr w:type="spellStart"/>
+      <w:r>
+        <w:rPr>
+          <w:lang w:eastAsia="zh-CN"/>
+        </w:rPr>
+        <w:t>GameContext</w:t>
+      </w:r>
+      <w:proofErr w:type="spellEnd"/>
+      <w:r>
+        <w:rPr>
+          <w:lang w:eastAsia="zh-CN"/>
+        </w:rPr>
+        <w:t xml:space="preserve"> osztály implementálja az </w:t>
+      </w:r>
+      <w:proofErr w:type="spellStart"/>
+      <w:r>
+        <w:rPr>
+          <w:lang w:eastAsia="zh-CN"/>
+        </w:rPr>
+        <w:t>IGameContext</w:t>
+      </w:r>
+      <w:proofErr w:type="spellEnd"/>
+      <w:r>
+        <w:rPr>
+          <w:lang w:eastAsia="zh-CN"/>
+        </w:rPr>
+        <w:t xml:space="preserve"> interfészt, és a játékmenet során használt központi kontextus objektumként szolgál, amely hozzáférést biztosít a szükséges komponensekhez.</w:t>
+      </w:r>
+    </w:p>
+    <w:p>
+      <w:pPr>
+        <w:rPr>
+          <w:lang w:eastAsia="zh-CN"/>
+        </w:rPr>
+      </w:pPr>
+      <w:r>
+        <w:rPr>
+          <w:noProof/>
+          <w:lang w:eastAsia="zh-CN"/>
+        </w:rPr>
+        <w:drawing>
+          <wp:inline distT="0" distB="0" distL="0" distR="0" wp14:anchorId="729282FE" wp14:editId="6EA22A13">
+            <wp:extent cx="5745480" cy="3924935"/>
+            <wp:effectExtent l="0" t="0" r="7620" b="0"/>
+            <wp:docPr id="604186248" name="Picture 2"/>
+            <wp:cNvGraphicFramePr>
+              <a:graphicFrameLocks xmlns:a="http://schemas.openxmlformats.org/drawingml/2006/main" noChangeAspect="1"/>
+            </wp:cNvGraphicFramePr>
+            <a:graphic xmlns:a="http://schemas.openxmlformats.org/drawingml/2006/main">
+              <a:graphicData uri="http://schemas.openxmlformats.org/drawingml/2006/picture">
+                <pic:pic xmlns:pic="http://schemas.openxmlformats.org/drawingml/2006/picture">
+                  <pic:nvPicPr>
+                    <pic:cNvPr id="0" name="Picture 2"/>
+                    <pic:cNvPicPr>
+                      <a:picLocks noChangeAspect="1" noChangeArrowheads="1"/>
+                    </pic:cNvPicPr>
+                  </pic:nvPicPr>
+                  <pic:blipFill>
+                    <a:blip r:embed="rId15">
+                      <a:extLst>
+                        <a:ext uri="{28A0092B-C50C-407E-A947-70E740481C1C}">
+                          <a14:useLocalDpi xmlns:a14="http://schemas.microsoft.com/office/drawing/2010/main" val="0"/>
+                        </a:ext>
+                      </a:extLst>
+                    </a:blip>
+                    <a:srcRect/>
+                    <a:stretch>
+                      <a:fillRect/>
+                    </a:stretch>
+                  </pic:blipFill>
+                  <pic:spPr bwMode="auto">
+                    <a:xfrm>
+                      <a:off x="0" y="0"/>
+                      <a:ext cx="5745480" cy="3924935"/>
+                    </a:xfrm>
+                    <a:prstGeom prst="rect">
+                      <a:avLst/>
+                    </a:prstGeom>
+                    <a:noFill/>
+                    <a:ln>
+                      <a:noFill/>
+                    </a:ln>
+                  </pic:spPr>
+                </pic:pic>
+              </a:graphicData>
+            </a:graphic>
+          </wp:inline>
+        </w:drawing>
+      </w:r>
+    </w:p>
+    <w:p>
+      <w:pPr>
+        <w:rPr>
+          <w:lang w:eastAsia="zh-CN"/>
+        </w:rPr>
+      </w:pPr>
+      <w:r>
+        <w:rPr>
+          <w:lang w:eastAsia="zh-CN"/>
+        </w:rPr>
+        <w:t xml:space="preserve">Az ábra a játékos körön belüli állapotokat mutatja be az </w:t>
+      </w:r>
+      <w:proofErr w:type="spellStart"/>
+      <w:r>
+        <w:rPr>
+          <w:lang w:eastAsia="zh-CN"/>
+        </w:rPr>
+        <w:t>IPlayerTurnState</w:t>
+      </w:r>
+      <w:proofErr w:type="spellEnd"/>
+      <w:r>
+        <w:rPr>
+          <w:lang w:eastAsia="zh-CN"/>
+        </w:rPr>
+        <w:t xml:space="preserve"> interfész és annak implementációi segítségével, amelyeket az előző diagramon szereplő </w:t>
+      </w:r>
+      <w:proofErr w:type="spellStart"/>
+      <w:r>
+        <w:rPr>
+          <w:lang w:eastAsia="zh-CN"/>
+        </w:rPr>
+        <w:t>PlayingState</w:t>
+      </w:r>
+      <w:proofErr w:type="spellEnd"/>
+      <w:r>
+        <w:rPr>
+          <w:lang w:eastAsia="zh-CN"/>
+        </w:rPr>
+        <w:t xml:space="preserve"> osztály használ. Ezek az állapotok a játékos körén belüli különböző fázisokat reprezentálják. A diagramon látható továbbá több, a játékmenetet támogató komponens is: az </w:t>
+      </w:r>
+      <w:proofErr w:type="spellStart"/>
+      <w:r>
+        <w:rPr>
+          <w:lang w:eastAsia="zh-CN"/>
+        </w:rPr>
+        <w:t>AgeHandler</w:t>
+      </w:r>
+      <w:proofErr w:type="spellEnd"/>
+      <w:r>
+        <w:rPr>
+          <w:lang w:eastAsia="zh-CN"/>
+        </w:rPr>
+        <w:t xml:space="preserve"> az egyes korok közötti átmenetek kezeléséért felel, a </w:t>
+      </w:r>
+      <w:proofErr w:type="spellStart"/>
+      <w:r>
+        <w:rPr>
+          <w:lang w:eastAsia="zh-CN"/>
+        </w:rPr>
+        <w:t>TurnHandler</w:t>
+      </w:r>
+      <w:proofErr w:type="spellEnd"/>
+      <w:r>
+        <w:rPr>
+          <w:lang w:eastAsia="zh-CN"/>
+        </w:rPr>
+        <w:t xml:space="preserve"> a soron következő játékos meghatározását végzi, míg a </w:t>
+      </w:r>
+      <w:proofErr w:type="spellStart"/>
+      <w:r>
+        <w:rPr>
+          <w:lang w:eastAsia="zh-CN"/>
+        </w:rPr>
+        <w:t>CostCalculator</w:t>
+      </w:r>
+      <w:proofErr w:type="spellEnd"/>
+      <w:r>
+        <w:rPr>
+          <w:lang w:eastAsia="zh-CN"/>
+        </w:rPr>
+        <w:t xml:space="preserve"> a kártyák és csodák megvásárolhatóságát számolja ki. A </w:t>
+      </w:r>
+      <w:proofErr w:type="spellStart"/>
+      <w:r>
+        <w:rPr>
+          <w:lang w:eastAsia="zh-CN"/>
+        </w:rPr>
+        <w:t>PlayerActionHandler</w:t>
+      </w:r>
+      <w:proofErr w:type="spellEnd"/>
+      <w:r>
+        <w:rPr>
+          <w:lang w:eastAsia="zh-CN"/>
+        </w:rPr>
+        <w:t xml:space="preserve"> a játékosok akcióinak feldolgozását végzi, a </w:t>
+      </w:r>
+      <w:proofErr w:type="spellStart"/>
+      <w:r>
+        <w:rPr>
+          <w:lang w:eastAsia="zh-CN"/>
+        </w:rPr>
+        <w:t>ChooseWonderHandler</w:t>
+      </w:r>
+      <w:proofErr w:type="spellEnd"/>
+      <w:r>
+        <w:rPr>
+          <w:lang w:eastAsia="zh-CN"/>
+        </w:rPr>
+        <w:t xml:space="preserve"> pedig a játék elején a csodák kiválasztását kezeli, amelyet az előző ábrán szereplő </w:t>
+      </w:r>
+      <w:proofErr w:type="spellStart"/>
+      <w:r>
+        <w:rPr>
+          <w:lang w:eastAsia="zh-CN"/>
+        </w:rPr>
+        <w:t>ChooseWonderState</w:t>
+      </w:r>
+      <w:proofErr w:type="spellEnd"/>
+      <w:r>
+        <w:rPr>
+          <w:lang w:eastAsia="zh-CN"/>
+        </w:rPr>
+        <w:t xml:space="preserve"> használ. A diagramon szereplő osztályok mindegyike interfészen keresztül kerül használatra, elősegítve a laza csatolást és a bővíthetőséget.</w:t>
+      </w:r>
+    </w:p>
+    <w:p>
+      <w:pPr>
+        <w:rPr>
+          <w:lang w:eastAsia="zh-CN"/>
+        </w:rPr>
+      </w:pPr>
+      <w:r>
+        <w:rPr>
+          <w:noProof/>
+          <w:lang w:eastAsia="zh-CN"/>
+        </w:rPr>
+        <w:lastRenderedPageBreak/>
+        <w:drawing>
+          <wp:inline distT="0" distB="0" distL="0" distR="0" wp14:anchorId="3AAAB288" wp14:editId="004CA865">
+            <wp:extent cx="5753735" cy="1294130"/>
+            <wp:effectExtent l="0" t="0" r="0" b="1270"/>
+            <wp:docPr id="24724115" name="Picture 3"/>
+            <wp:cNvGraphicFramePr>
+              <a:graphicFrameLocks xmlns:a="http://schemas.openxmlformats.org/drawingml/2006/main" noChangeAspect="1"/>
+            </wp:cNvGraphicFramePr>
+            <a:graphic xmlns:a="http://schemas.openxmlformats.org/drawingml/2006/main">
+              <a:graphicData uri="http://schemas.openxmlformats.org/drawingml/2006/picture">
+                <pic:pic xmlns:pic="http://schemas.openxmlformats.org/drawingml/2006/picture">
+                  <pic:nvPicPr>
+                    <pic:cNvPr id="0" name="Picture 3"/>
+                    <pic:cNvPicPr>
+                      <a:picLocks noChangeAspect="1" noChangeArrowheads="1"/>
+                    </pic:cNvPicPr>
+                  </pic:nvPicPr>
+                  <pic:blipFill>
+                    <a:blip r:embed="rId16" cstate="print">
+                      <a:extLst>
+                        <a:ext uri="{28A0092B-C50C-407E-A947-70E740481C1C}">
+                          <a14:useLocalDpi xmlns:a14="http://schemas.microsoft.com/office/drawing/2010/main" val="0"/>
+                        </a:ext>
+                      </a:extLst>
+                    </a:blip>
+                    <a:srcRect/>
+                    <a:stretch>
+                      <a:fillRect/>
+                    </a:stretch>
+                  </pic:blipFill>
+                  <pic:spPr bwMode="auto">
+                    <a:xfrm>
+                      <a:off x="0" y="0"/>
+                      <a:ext cx="5753735" cy="1294130"/>
+                    </a:xfrm>
+                    <a:prstGeom prst="rect">
+                      <a:avLst/>
+                    </a:prstGeom>
+                    <a:noFill/>
+                    <a:ln>
+                      <a:noFill/>
+                    </a:ln>
+                  </pic:spPr>
+                </pic:pic>
+              </a:graphicData>
+            </a:graphic>
+          </wp:inline>
+        </w:drawing>
+      </w:r>
+    </w:p>
+    <w:p>
+      <w:pPr>
+        <w:rPr>
+          <w:lang w:eastAsia="zh-CN"/>
+        </w:rPr>
+      </w:pPr>
+      <w:r>
+        <w:rPr>
+          <w:lang w:eastAsia="zh-CN"/>
+        </w:rPr>
+        <w:t xml:space="preserve">Az ábra a különböző korokat reprezentáló osztályokat tartalmazza. Az </w:t>
+      </w:r>
+      <w:proofErr w:type="spellStart"/>
+      <w:r>
+        <w:rPr>
+          <w:lang w:eastAsia="zh-CN"/>
+        </w:rPr>
+        <w:t>AgesEnum</w:t>
+      </w:r>
+      <w:proofErr w:type="spellEnd"/>
+      <w:r>
+        <w:rPr>
+          <w:lang w:eastAsia="zh-CN"/>
+        </w:rPr>
+        <w:t xml:space="preserve"> enumeráció biztosítja a korok egyértelmű azonosítását, így a vezérlési logika nem igényel konkrét osztálytípusok ellenőrzését vagy feltételes elágazásokat az egyes korok alapján.</w:t>
+      </w:r>
+    </w:p>
+    <w:p>
+      <w:pPr>
+        <w:rPr>
+          <w:lang w:eastAsia="zh-CN"/>
+        </w:rPr>
+      </w:pPr>
+      <w:r>
+        <w:rPr>
+          <w:noProof/>
+          <w:lang w:eastAsia="zh-CN"/>
+        </w:rPr>
+        <w:drawing>
+          <wp:inline distT="0" distB="0" distL="0" distR="0" wp14:anchorId="12F075CC" wp14:editId="2042EBAB">
+            <wp:extent cx="5749925" cy="2304415"/>
+            <wp:effectExtent l="0" t="0" r="3175" b="635"/>
+            <wp:docPr id="1151847647" name="Picture 1"/>
+            <wp:cNvGraphicFramePr>
+              <a:graphicFrameLocks xmlns:a="http://schemas.openxmlformats.org/drawingml/2006/main" noChangeAspect="1"/>
+            </wp:cNvGraphicFramePr>
+            <a:graphic xmlns:a="http://schemas.openxmlformats.org/drawingml/2006/main">
+              <a:graphicData uri="http://schemas.openxmlformats.org/drawingml/2006/picture">
+                <pic:pic xmlns:pic="http://schemas.openxmlformats.org/drawingml/2006/picture">
+                  <pic:nvPicPr>
+                    <pic:cNvPr id="0" name="Picture 1"/>
+                    <pic:cNvPicPr>
+                      <a:picLocks noChangeAspect="1" noChangeArrowheads="1"/>
+                    </pic:cNvPicPr>
+                  </pic:nvPicPr>
+                  <pic:blipFill>
+                    <a:blip r:embed="rId17" cstate="print">
+                      <a:extLst>
+                        <a:ext uri="{28A0092B-C50C-407E-A947-70E740481C1C}">
+                          <a14:useLocalDpi xmlns:a14="http://schemas.microsoft.com/office/drawing/2010/main" val="0"/>
+                        </a:ext>
+                      </a:extLst>
+                    </a:blip>
+                    <a:srcRect/>
+                    <a:stretch>
+                      <a:fillRect/>
+                    </a:stretch>
+                  </pic:blipFill>
+                  <pic:spPr bwMode="auto">
+                    <a:xfrm>
+                      <a:off x="0" y="0"/>
+                      <a:ext cx="5749925" cy="2304415"/>
+                    </a:xfrm>
+                    <a:prstGeom prst="rect">
+                      <a:avLst/>
+                    </a:prstGeom>
+                    <a:noFill/>
+                    <a:ln>
+                      <a:noFill/>
+                    </a:ln>
+                  </pic:spPr>
+                </pic:pic>
+              </a:graphicData>
+            </a:graphic>
+          </wp:inline>
+        </w:drawing>
+      </w:r>
+    </w:p>
+    <w:p>
+      <w:pPr>
+        <w:rPr>
+          <w:lang w:eastAsia="zh-CN"/>
+        </w:rPr>
+      </w:pPr>
+      <w:r>
+        <w:rPr>
+          <w:lang w:eastAsia="zh-CN"/>
+        </w:rPr>
+        <w:t xml:space="preserve">Az ábra a játék különböző játékelemeket reprezentáló osztályait mutatja be. A diagram tartalmazza az egyes kártyatípusok felépítését, valamint azok belső kapcsolatait kompozíciós viszonyokon keresztül. A játékost reprezentáló </w:t>
+      </w:r>
+      <w:proofErr w:type="spellStart"/>
+      <w:r>
+        <w:rPr>
+          <w:lang w:eastAsia="zh-CN"/>
+        </w:rPr>
+        <w:t>Player</w:t>
+      </w:r>
+      <w:proofErr w:type="spellEnd"/>
+      <w:r>
+        <w:rPr>
+          <w:lang w:eastAsia="zh-CN"/>
+        </w:rPr>
+        <w:t xml:space="preserve"> osztály szintén megjelenik, amely a játékmenet során a játékoshoz tartozó játékelemeket kezeli. Az ábrán látható továbbá a </w:t>
+      </w:r>
+      <w:proofErr w:type="spellStart"/>
+      <w:r>
+        <w:rPr>
+          <w:lang w:eastAsia="zh-CN"/>
+        </w:rPr>
+        <w:t>PlayerProperties</w:t>
+      </w:r>
+      <w:proofErr w:type="spellEnd"/>
+      <w:r>
+        <w:rPr>
+          <w:lang w:eastAsia="zh-CN"/>
+        </w:rPr>
+        <w:t xml:space="preserve"> osztály, amely a játék során kiszámított tulajdonságokat foglalja össze. Ezt az objektumot a </w:t>
+      </w:r>
+      <w:proofErr w:type="spellStart"/>
+      <w:r>
+        <w:rPr>
+          <w:lang w:eastAsia="zh-CN"/>
+        </w:rPr>
+        <w:t>Player</w:t>
+      </w:r>
+      <w:proofErr w:type="spellEnd"/>
+      <w:r>
+        <w:rPr>
+          <w:lang w:eastAsia="zh-CN"/>
+        </w:rPr>
+        <w:t xml:space="preserve"> osztály</w:t>
+      </w:r>
+      <w:r>
+        <w:rPr>
+          <w:lang w:eastAsia="zh-CN"/>
+        </w:rPr>
+        <w:t xml:space="preserve"> </w:t>
+      </w:r>
+      <w:proofErr w:type="spellStart"/>
+      <w:r>
+        <w:rPr>
+          <w:lang w:eastAsia="zh-CN"/>
+        </w:rPr>
+        <w:t>GetPlayerProperties</w:t>
+      </w:r>
+      <w:proofErr w:type="spellEnd"/>
+      <w:r>
+        <w:rPr>
+          <w:lang w:eastAsia="zh-CN"/>
+        </w:rPr>
+        <w:t xml:space="preserve"> </w:t>
+      </w:r>
+      <w:r>
+        <w:rPr>
+          <w:lang w:eastAsia="zh-CN"/>
+        </w:rPr>
+        <w:t>metódusa hozza létre az aktuális játékállapot alapján.</w:t>
+      </w:r>
+    </w:p>
+    <w:p>
+      <w:pPr>
+        <w:rPr>
+          <w:lang w:eastAsia="zh-CN"/>
+        </w:rPr>
+      </w:pPr>
+      <w:r>
+        <w:rPr>
+          <w:noProof/>
+          <w:lang w:eastAsia="zh-CN"/>
+        </w:rPr>
+        <w:lastRenderedPageBreak/>
+        <w:drawing>
+          <wp:inline distT="0" distB="0" distL="0" distR="0" wp14:anchorId="099D13D5" wp14:editId="6B457A27">
+            <wp:extent cx="5753100" cy="3740150"/>
+            <wp:effectExtent l="0" t="0" r="0" b="0"/>
+            <wp:docPr id="1138520615" name="Picture 2"/>
+            <wp:cNvGraphicFramePr>
+              <a:graphicFrameLocks xmlns:a="http://schemas.openxmlformats.org/drawingml/2006/main" noChangeAspect="1"/>
+            </wp:cNvGraphicFramePr>
+            <a:graphic xmlns:a="http://schemas.openxmlformats.org/drawingml/2006/main">
+              <a:graphicData uri="http://schemas.openxmlformats.org/drawingml/2006/picture">
+                <pic:pic xmlns:pic="http://schemas.openxmlformats.org/drawingml/2006/picture">
+                  <pic:nvPicPr>
+                    <pic:cNvPr id="0" name="Picture 2"/>
+                    <pic:cNvPicPr>
+                      <a:picLocks noChangeAspect="1" noChangeArrowheads="1"/>
+                    </pic:cNvPicPr>
+                  </pic:nvPicPr>
+                  <pic:blipFill>
+                    <a:blip r:embed="rId18">
+                      <a:extLst>
+                        <a:ext uri="{28A0092B-C50C-407E-A947-70E740481C1C}">
+                          <a14:useLocalDpi xmlns:a14="http://schemas.microsoft.com/office/drawing/2010/main" val="0"/>
+                        </a:ext>
+                      </a:extLst>
+                    </a:blip>
+                    <a:srcRect/>
+                    <a:stretch>
+                      <a:fillRect/>
+                    </a:stretch>
+                  </pic:blipFill>
+                  <pic:spPr bwMode="auto">
+                    <a:xfrm>
+                      <a:off x="0" y="0"/>
+                      <a:ext cx="5753100" cy="3740150"/>
+                    </a:xfrm>
+                    <a:prstGeom prst="rect">
+                      <a:avLst/>
+                    </a:prstGeom>
+                    <a:noFill/>
+                    <a:ln>
+                      <a:noFill/>
+                    </a:ln>
+                  </pic:spPr>
+                </pic:pic>
+              </a:graphicData>
+            </a:graphic>
+          </wp:inline>
+        </w:drawing>
+      </w:r>
+    </w:p>
+    <w:p>
+      <w:pPr>
+        <w:rPr>
+          <w:lang w:eastAsia="zh-CN"/>
+        </w:rPr>
+      </w:pPr>
+      <w:r>
+        <w:rPr>
+          <w:lang w:eastAsia="zh-CN"/>
+        </w:rPr>
+        <w:t xml:space="preserve">A jelenlegi ábra a különböző játékelemeket kezelő lista interfészeket, valamint az ezek létrehozásáért felelős </w:t>
+      </w:r>
+      <w:proofErr w:type="spellStart"/>
+      <w:r>
+        <w:rPr>
+          <w:lang w:eastAsia="zh-CN"/>
+        </w:rPr>
+        <w:t>factory</w:t>
+      </w:r>
+      <w:proofErr w:type="spellEnd"/>
+      <w:r>
+        <w:rPr>
+          <w:lang w:eastAsia="zh-CN"/>
+        </w:rPr>
+        <w:t xml:space="preserve"> osztályokat mutatja be. Az </w:t>
+      </w:r>
+      <w:proofErr w:type="spellStart"/>
+      <w:r>
+        <w:rPr>
+          <w:lang w:eastAsia="zh-CN"/>
+        </w:rPr>
+        <w:t>IGameElements</w:t>
+      </w:r>
+      <w:proofErr w:type="spellEnd"/>
+      <w:r>
+        <w:rPr>
+          <w:lang w:eastAsia="zh-CN"/>
+        </w:rPr>
+        <w:t xml:space="preserve"> interfész központi hozzáférési pontot biztosít a játék során használt játékelem</w:t>
+      </w:r>
+      <w:r>
+        <w:rPr>
+          <w:lang w:eastAsia="zh-CN"/>
+        </w:rPr>
+        <w:noBreakHyphen/>
+        <w:t xml:space="preserve">gyűjteményekhez. A </w:t>
+      </w:r>
+      <w:proofErr w:type="spellStart"/>
+      <w:r>
+        <w:rPr>
+          <w:lang w:eastAsia="zh-CN"/>
+        </w:rPr>
+        <w:t>ResetElements</w:t>
+      </w:r>
+      <w:proofErr w:type="spellEnd"/>
+      <w:r>
+        <w:rPr>
+          <w:lang w:eastAsia="zh-CN"/>
+        </w:rPr>
+        <w:t xml:space="preserve"> metódus feladata ezen elemek </w:t>
+      </w:r>
+      <w:proofErr w:type="spellStart"/>
+      <w:r>
+        <w:rPr>
+          <w:lang w:eastAsia="zh-CN"/>
+        </w:rPr>
+        <w:t>újrainicializálása</w:t>
+      </w:r>
+      <w:proofErr w:type="spellEnd"/>
+      <w:r>
+        <w:rPr>
+          <w:lang w:eastAsia="zh-CN"/>
+        </w:rPr>
+        <w:t xml:space="preserve">, amelyet a megfelelő </w:t>
+      </w:r>
+      <w:proofErr w:type="spellStart"/>
+      <w:r>
+        <w:rPr>
+          <w:lang w:eastAsia="zh-CN"/>
+        </w:rPr>
+        <w:t>factory</w:t>
+      </w:r>
+      <w:proofErr w:type="spellEnd"/>
+      <w:r>
+        <w:rPr>
+          <w:lang w:eastAsia="zh-CN"/>
+        </w:rPr>
+        <w:t xml:space="preserve"> osztályokon keresztül végez el, biztosítva az egységes és elkülönített </w:t>
+      </w:r>
+      <w:proofErr w:type="spellStart"/>
+      <w:r>
+        <w:rPr>
+          <w:lang w:eastAsia="zh-CN"/>
+        </w:rPr>
+        <w:t>példányosítást</w:t>
+      </w:r>
+      <w:proofErr w:type="spellEnd"/>
+      <w:r>
+        <w:rPr>
+          <w:lang w:eastAsia="zh-CN"/>
+        </w:rPr>
+        <w:t>.</w:t>
+      </w:r>
+    </w:p>
+    <w:p>
+      <w:pPr>
+        <w:spacing w:after="0" w:line="300" w:lineRule="atLeast"/>
+        <w:jc w:val="left"/>
+        <w:rPr>
+          <w:lang w:eastAsia="zh-CN"/>
+        </w:rPr>
+      </w:pPr>
+      <w:r>
+        <w:rPr>
+          <w:noProof/>
+          <w:lang w:eastAsia="zh-CN"/>
+        </w:rPr>
+        <w:drawing>
+          <wp:inline distT="0" distB="0" distL="0" distR="0" wp14:anchorId="3E7A0348" wp14:editId="19537DCD">
+            <wp:extent cx="5746750" cy="1905000"/>
+            <wp:effectExtent l="0" t="0" r="6350" b="0"/>
+            <wp:docPr id="1051206389" name="Picture 3"/>
+            <wp:cNvGraphicFramePr>
+              <a:graphicFrameLocks xmlns:a="http://schemas.openxmlformats.org/drawingml/2006/main" noChangeAspect="1"/>
+            </wp:cNvGraphicFramePr>
+            <a:graphic xmlns:a="http://schemas.openxmlformats.org/drawingml/2006/main">
+              <a:graphicData uri="http://schemas.openxmlformats.org/drawingml/2006/picture">
+                <pic:pic xmlns:pic="http://schemas.openxmlformats.org/drawingml/2006/picture">
+                  <pic:nvPicPr>
+                    <pic:cNvPr id="0" name="Picture 3"/>
+                    <pic:cNvPicPr>
+                      <a:picLocks noChangeAspect="1" noChangeArrowheads="1"/>
+                    </pic:cNvPicPr>
+                  </pic:nvPicPr>
+                  <pic:blipFill>
+                    <a:blip r:embed="rId19">
+                      <a:extLst>
+                        <a:ext uri="{28A0092B-C50C-407E-A947-70E740481C1C}">
+                          <a14:useLocalDpi xmlns:a14="http://schemas.microsoft.com/office/drawing/2010/main" val="0"/>
+                        </a:ext>
+                      </a:extLst>
+                    </a:blip>
+                    <a:srcRect/>
+                    <a:stretch>
+                      <a:fillRect/>
+                    </a:stretch>
+                  </pic:blipFill>
+                  <pic:spPr bwMode="auto">
+                    <a:xfrm>
+                      <a:off x="0" y="0"/>
+                      <a:ext cx="5746750" cy="1905000"/>
+                    </a:xfrm>
+                    <a:prstGeom prst="rect">
+                      <a:avLst/>
+                    </a:prstGeom>
+                    <a:noFill/>
+                    <a:ln>
+                      <a:noFill/>
+                    </a:ln>
+                  </pic:spPr>
+                </pic:pic>
+              </a:graphicData>
+            </a:graphic>
+          </wp:inline>
+        </w:drawing>
+      </w:r>
+    </w:p>
+    <w:p>
+      <w:pPr>
+        <w:rPr>
+          <w:lang w:eastAsia="zh-CN"/>
+        </w:rPr>
+      </w:pPr>
+      <w:r>
+        <w:rPr>
+          <w:lang w:eastAsia="zh-CN"/>
+        </w:rPr>
+        <w:t xml:space="preserve">Ez az ábra a kártyakompozíció felépítését reprezentáló osztályokat, valamint azok létrehozásáért felelős </w:t>
+      </w:r>
+      <w:proofErr w:type="spellStart"/>
+      <w:r>
+        <w:rPr>
+          <w:lang w:eastAsia="zh-CN"/>
+        </w:rPr>
+        <w:t>factory</w:t>
+      </w:r>
+      <w:proofErr w:type="spellEnd"/>
+      <w:r>
+        <w:rPr>
+          <w:lang w:eastAsia="zh-CN"/>
+        </w:rPr>
+        <w:t xml:space="preserve"> osztályokat mutatja be. A </w:t>
+      </w:r>
+      <w:proofErr w:type="spellStart"/>
+      <w:r>
+        <w:rPr>
+          <w:lang w:eastAsia="zh-CN"/>
+        </w:rPr>
+        <w:t>CardComposition</w:t>
+      </w:r>
+      <w:proofErr w:type="spellEnd"/>
+      <w:r>
+        <w:rPr>
+          <w:lang w:eastAsia="zh-CN"/>
+        </w:rPr>
+        <w:t xml:space="preserve"> osztály </w:t>
+      </w:r>
+      <w:proofErr w:type="spellStart"/>
+      <w:r>
+        <w:rPr>
+          <w:lang w:eastAsia="zh-CN"/>
+        </w:rPr>
+        <w:t>CardNode</w:t>
+      </w:r>
+      <w:proofErr w:type="spellEnd"/>
+      <w:r>
+        <w:rPr>
+          <w:lang w:eastAsia="zh-CN"/>
+        </w:rPr>
+        <w:t xml:space="preserve"> elemeket tartalmaz, míg a </w:t>
+      </w:r>
+      <w:proofErr w:type="spellStart"/>
+      <w:r>
+        <w:rPr>
+          <w:lang w:eastAsia="zh-CN"/>
+        </w:rPr>
+        <w:t>CardNode</w:t>
+      </w:r>
+      <w:proofErr w:type="spellEnd"/>
+      <w:r>
+        <w:rPr>
+          <w:lang w:eastAsia="zh-CN"/>
+        </w:rPr>
+        <w:t xml:space="preserve"> osztály meghatározza azokat a további </w:t>
+      </w:r>
+      <w:proofErr w:type="spellStart"/>
+      <w:r>
+        <w:rPr>
+          <w:lang w:eastAsia="zh-CN"/>
+        </w:rPr>
+        <w:t>CardNode</w:t>
+      </w:r>
+      <w:r>
+        <w:rPr>
+          <w:lang w:eastAsia="zh-CN"/>
+        </w:rPr>
+        <w:noBreakHyphen/>
+        <w:t>okat</w:t>
+      </w:r>
+      <w:proofErr w:type="spellEnd"/>
+      <w:r>
+        <w:rPr>
+          <w:lang w:eastAsia="zh-CN"/>
+        </w:rPr>
+        <w:t>, amelyek az adott kártyát lefedik. Ennek köszönhetően a két osztály együttesen a kártyák elrendezését leíró gráfstruktúrát alkot.</w:t>
+      </w:r>
+    </w:p>
+    <w:p>
+      <w:pPr>
+        <w:rPr>
+          <w:lang w:eastAsia="zh-CN"/>
+        </w:rPr>
+      </w:pPr>
+      <w:r>
+        <w:rPr>
+          <w:noProof/>
+          <w:lang w:eastAsia="zh-CN"/>
+        </w:rPr>
+        <w:lastRenderedPageBreak/>
+        <w:drawing>
+          <wp:inline distT="0" distB="0" distL="0" distR="0" wp14:anchorId="024A80E4" wp14:editId="6C4AC867">
+            <wp:extent cx="5753100" cy="2146300"/>
+            <wp:effectExtent l="0" t="0" r="0" b="6350"/>
+            <wp:docPr id="690534688" name="Picture 4"/>
+            <wp:cNvGraphicFramePr>
+              <a:graphicFrameLocks xmlns:a="http://schemas.openxmlformats.org/drawingml/2006/main" noChangeAspect="1"/>
+            </wp:cNvGraphicFramePr>
+            <a:graphic xmlns:a="http://schemas.openxmlformats.org/drawingml/2006/main">
+              <a:graphicData uri="http://schemas.openxmlformats.org/drawingml/2006/picture">
+                <pic:pic xmlns:pic="http://schemas.openxmlformats.org/drawingml/2006/picture">
+                  <pic:nvPicPr>
+                    <pic:cNvPr id="0" name="Picture 4"/>
+                    <pic:cNvPicPr>
+                      <a:picLocks noChangeAspect="1" noChangeArrowheads="1"/>
+                    </pic:cNvPicPr>
+                  </pic:nvPicPr>
+                  <pic:blipFill>
+                    <a:blip r:embed="rId20">
+                      <a:extLst>
+                        <a:ext uri="{28A0092B-C50C-407E-A947-70E740481C1C}">
+                          <a14:useLocalDpi xmlns:a14="http://schemas.microsoft.com/office/drawing/2010/main" val="0"/>
+                        </a:ext>
+                      </a:extLst>
+                    </a:blip>
+                    <a:srcRect/>
+                    <a:stretch>
+                      <a:fillRect/>
+                    </a:stretch>
+                  </pic:blipFill>
+                  <pic:spPr bwMode="auto">
+                    <a:xfrm>
+                      <a:off x="0" y="0"/>
+                      <a:ext cx="5753100" cy="2146300"/>
+                    </a:xfrm>
+                    <a:prstGeom prst="rect">
+                      <a:avLst/>
+                    </a:prstGeom>
+                    <a:noFill/>
+                    <a:ln>
+                      <a:noFill/>
+                    </a:ln>
+                  </pic:spPr>
+                </pic:pic>
+              </a:graphicData>
+            </a:graphic>
+          </wp:inline>
+        </w:drawing>
+      </w:r>
+    </w:p>
+    <w:p>
+      <w:pPr>
+        <w:rPr>
+          <w:lang w:eastAsia="zh-CN"/>
+        </w:rPr>
+      </w:pPr>
+      <w:r>
+        <w:rPr>
+          <w:lang w:eastAsia="zh-CN"/>
+        </w:rPr>
+        <w:t xml:space="preserve">Az ábra a külső komponensek által gyakran használt interfészeket és osztályokat mutatja be. Ezek egyrészt az eseménykezeléshez, másrészt a játékos lépéseinek kezeléséhez kapcsolódnak. A külvilág felé átadott, játékoslépéseket reprezentáló </w:t>
+      </w:r>
+      <w:proofErr w:type="spellStart"/>
+      <w:r>
+        <w:rPr>
+          <w:lang w:eastAsia="zh-CN"/>
+        </w:rPr>
+        <w:t>IPlayerAction</w:t>
+      </w:r>
+      <w:proofErr w:type="spellEnd"/>
+      <w:r>
+        <w:rPr>
+          <w:lang w:eastAsia="zh-CN"/>
+        </w:rPr>
+        <w:t xml:space="preserve"> objektumok egy </w:t>
+      </w:r>
+      <w:proofErr w:type="spellStart"/>
+      <w:r>
+        <w:rPr>
+          <w:lang w:eastAsia="zh-CN"/>
+        </w:rPr>
+        <w:t>PlayerActionWrapper</w:t>
+      </w:r>
+      <w:proofErr w:type="spellEnd"/>
+      <w:r>
+        <w:rPr>
+          <w:lang w:eastAsia="zh-CN"/>
+        </w:rPr>
+        <w:t xml:space="preserve"> osztályon keresztül érhetők el. Az eseménykezelés az </w:t>
+      </w:r>
+      <w:proofErr w:type="spellStart"/>
+      <w:r>
+        <w:rPr>
+          <w:lang w:eastAsia="zh-CN"/>
+        </w:rPr>
+        <w:t>IEventManager</w:t>
+      </w:r>
+      <w:proofErr w:type="spellEnd"/>
+      <w:r>
+        <w:rPr>
+          <w:lang w:eastAsia="zh-CN"/>
+        </w:rPr>
+        <w:t xml:space="preserve"> interfészen keresztül történik, amely lehetőséget biztosít a </w:t>
+      </w:r>
+      <w:proofErr w:type="spellStart"/>
+      <w:r>
+        <w:rPr>
+          <w:lang w:eastAsia="zh-CN"/>
+        </w:rPr>
+        <w:t>GameEvent</w:t>
+      </w:r>
+      <w:proofErr w:type="spellEnd"/>
+      <w:r>
+        <w:rPr>
+          <w:lang w:eastAsia="zh-CN"/>
+        </w:rPr>
+        <w:t xml:space="preserve"> osztály különböző </w:t>
+      </w:r>
+      <w:proofErr w:type="spellStart"/>
+      <w:r>
+        <w:rPr>
+          <w:lang w:eastAsia="zh-CN"/>
+        </w:rPr>
+        <w:t>leszármazottaira</w:t>
+      </w:r>
+      <w:proofErr w:type="spellEnd"/>
+      <w:r>
+        <w:rPr>
+          <w:lang w:eastAsia="zh-CN"/>
+        </w:rPr>
+        <w:t xml:space="preserve"> való feliratkozásra.</w:t>
+      </w:r>
+    </w:p>
+    <w:p>
+      <w:pPr>
+        <w:pStyle w:val="Heading4"/>
+        <w:rPr>
+          <w:lang w:eastAsia="zh-CN"/>
+        </w:rPr>
+      </w:pPr>
+      <w:proofErr w:type="spellStart"/>
+      <w:proofErr w:type="gramStart"/>
+      <w:r>
+        <w:rPr>
+          <w:lang w:eastAsia="zh-CN"/>
+        </w:rPr>
+        <w:t>SevenWonders.Game.Engine</w:t>
+      </w:r>
+      <w:proofErr w:type="spellEnd"/>
+      <w:proofErr w:type="gramEnd"/>
+    </w:p>
+    <w:p>
+      <w:pPr>
+        <w:rPr>
+          <w:lang w:eastAsia="zh-CN"/>
+        </w:rPr>
+      </w:pPr>
+    </w:p>
+    <w:p>
+      <w:pPr>
+        <w:pStyle w:val="Heading4"/>
+        <w:rPr>
+          <w:lang w:eastAsia="zh-CN"/>
+        </w:rPr>
+      </w:pPr>
+      <w:proofErr w:type="spellStart"/>
+      <w:proofErr w:type="gramStart"/>
+      <w:r>
+        <w:rPr>
+          <w:lang w:eastAsia="zh-CN"/>
+        </w:rPr>
+        <w:t>SevenWonders.</w:t>
+      </w:r>
+      <w:r>
+        <w:rPr>
+          <w:lang w:eastAsia="zh-CN"/>
+        </w:rPr>
+        <w:t>Web</w:t>
+      </w:r>
+      <w:r>
+        <w:rPr>
+          <w:lang w:eastAsia="zh-CN"/>
+        </w:rPr>
+        <w:t>.</w:t>
+      </w:r>
+      <w:r>
+        <w:rPr>
+          <w:lang w:eastAsia="zh-CN"/>
+        </w:rPr>
+        <w:t>Server</w:t>
+      </w:r>
+      <w:r>
+        <w:rPr>
+          <w:lang w:eastAsia="zh-CN"/>
+        </w:rPr>
+        <w:t>.Model</w:t>
+      </w:r>
+      <w:proofErr w:type="spellEnd"/>
+      <w:proofErr w:type="gramEnd"/>
+    </w:p>
+    <w:p>
+      <w:pPr>
+        <w:pStyle w:val="Heading4"/>
+        <w:rPr>
+          <w:lang w:eastAsia="zh-CN"/>
+        </w:rPr>
+      </w:pPr>
+      <w:proofErr w:type="spellStart"/>
+      <w:r>
+        <w:rPr>
+          <w:lang w:eastAsia="zh-CN"/>
+        </w:rPr>
+        <w:t>SevenWonders.AI.Model</w:t>
+      </w:r>
+      <w:proofErr w:type="spellEnd"/>
+    </w:p>
+    <w:p>
+      <w:pPr>
+        <w:rPr>
+          <w:lang w:eastAsia="zh-CN"/>
+        </w:rPr>
+      </w:pPr>
+    </w:p>
+    <w:p>
+      <w:pPr>
+        <w:rPr>
+          <w:lang w:eastAsia="zh-CN"/>
+        </w:rPr>
+      </w:pPr>
+    </w:p>
+    <w:p>
+      <w:pPr>
+        <w:rPr>
+          <w:lang w:eastAsia="zh-CN"/>
+        </w:rPr>
+      </w:pPr>
+    </w:p>
+    <w:p>
+      <w:pPr>
+        <w:rPr>
+          <w:lang w:eastAsia="zh-CN"/>
+        </w:rPr>
+      </w:pPr>
+    </w:p>
+    <w:p>
+      <w:pPr>
         <w:pStyle w:val="Heading3"/>
         <w:rPr>
           <w:lang w:eastAsia="zh-CN"/>
@@ -9617,6 +10870,7 @@
         <w:rPr>
           <w:lang w:eastAsia="zh-CN"/>
         </w:rPr>
+        <w:lastRenderedPageBreak/>
         <w:t>Algoritmus</w:t>
       </w:r>
     </w:p>
@@ -9740,7 +10994,6 @@
         <w:rPr>
           <w:lang w:eastAsia="zh-CN"/>
         </w:rPr>
-        <w:lastRenderedPageBreak/>
         <w:t>A választott algoritmus jól illeszkedik a játék természetéhez, mivel képes összetett döntési szituációk kezelésére, miközben megfelelő stabilitást biztosít a tanítás során.</w:t>
       </w:r>
     </w:p>
@@ -9918,7 +11171,7 @@
       </w:pPr>
     </w:p>
     <w:sectPr>
-      <w:footerReference w:type="default" r:id="rId18"/>
+      <w:footerReference w:type="default" r:id="rId25"/>
       <w:pgSz w:w="11906" w:h="16838"/>
       <w:pgMar w:top="1418" w:right="1418" w:bottom="1418" w:left="1418" w:header="709" w:footer="709" w:gutter="0"/>
       <w:pgNumType w:start="1"/>
@@ -11319,7 +12572,6 @@
   <w:style w:type="character" w:default="1" w:styleId="DefaultParagraphFont">
     <w:name w:val="Default Paragraph Font"/>
     <w:uiPriority w:val="1"/>
-    <w:semiHidden/>
     <w:unhideWhenUsed/>
   </w:style>
   <w:style w:type="table" w:default="1" w:styleId="TableNormal">
@@ -11854,6 +13106,19 @@
       <w:sz w:val="24"/>
     </w:rPr>
   </w:style>
+  <w:style w:type="character" w:styleId="HTMLCode">
+    <w:name w:val="HTML Code"/>
+    <w:basedOn w:val="DefaultParagraphFont"/>
+    <w:uiPriority w:val="99"/>
+    <w:semiHidden/>
+    <w:unhideWhenUsed/>
+    <w:rsid w:val="00F763BC"/>
+    <w:rPr>
+      <w:rFonts w:ascii="Courier New" w:eastAsia="Times New Roman" w:hAnsi="Courier New" w:cs="Courier New"/>
+      <w:sz w:val="20"/>
+      <w:szCs w:val="20"/>
+    </w:rPr>
+  </w:style>
 </w:styles>
 </file>
 
@@ -12153,6 +13418,19 @@
 </file>
 
 <file path=customXml/item1.xml><?xml version="1.0" encoding="utf-8"?>
+<b:Sources xmlns:b="http://schemas.openxmlformats.org/officeDocument/2006/bibliography" xmlns="http://schemas.openxmlformats.org/officeDocument/2006/bibliography" SelectedStyle="\APASixthEditionOfficeOnline.xsl" StyleName="APA" Version="6"/>
+</file>
+
+<file path=customXml/item2.xml><?xml version="1.0" encoding="utf-8"?>
+<?mso-contentType ?>
+<FormTemplates xmlns="http://schemas.microsoft.com/sharepoint/v3/contenttype/forms">
+  <Display>DocumentLibraryForm</Display>
+  <Edit>DocumentLibraryForm</Edit>
+  <New>DocumentLibraryForm</New>
+</FormTemplates>
+</file>
+
+<file path=customXml/item3.xml><?xml version="1.0" encoding="utf-8"?>
 <ct:contentTypeSchema xmlns:ct="http://schemas.microsoft.com/office/2006/metadata/contentType" xmlns:ma="http://schemas.microsoft.com/office/2006/metadata/properties/metaAttributes" ct:_="" ma:_="" ma:contentTypeName="Document" ma:contentTypeID="0x01010057D746A6CC7228419059D1F304ECB892" ma:contentTypeVersion="6" ma:contentTypeDescription="Create a new document." ma:contentTypeScope="" ma:versionID="230bd601e8ab138a3182c21189d57f93">
   <xsd:schema xmlns:xsd="http://www.w3.org/2001/XMLSchema" xmlns:xs="http://www.w3.org/2001/XMLSchema" xmlns:p="http://schemas.microsoft.com/office/2006/metadata/properties" xmlns:ns2="23369ae5-05ef-4c7c-a662-deac929baaef" targetNamespace="http://schemas.microsoft.com/office/2006/metadata/properties" ma:root="true" ma:fieldsID="ed8cacf55a6d923cbbf7f604d05b507d" ns2:_="">
     <xsd:import namespace="23369ae5-05ef-4c7c-a662-deac929baaef"/>
@@ -12310,20 +13588,23 @@
 </ct:contentTypeSchema>
 </file>
 
-<file path=customXml/item2.xml><?xml version="1.0" encoding="utf-8"?>
-<?mso-contentType ?>
-<FormTemplates xmlns="http://schemas.microsoft.com/sharepoint/v3/contenttype/forms">
-  <Display>DocumentLibraryForm</Display>
-  <Edit>DocumentLibraryForm</Edit>
-  <New>DocumentLibraryForm</New>
-</FormTemplates>
+<file path=customXml/itemProps1.xml><?xml version="1.0" encoding="utf-8"?>
+<ds:datastoreItem xmlns:ds="http://schemas.openxmlformats.org/officeDocument/2006/customXml" ds:itemID="{E9F6CDE2-636C-4043-AFFC-7CB0CE5DF55A}">
+  <ds:schemaRefs>
+    <ds:schemaRef ds:uri="http://schemas.openxmlformats.org/officeDocument/2006/bibliography"/>
+  </ds:schemaRefs>
+</ds:datastoreItem>
 </file>
 
-<file path=customXml/item3.xml><?xml version="1.0" encoding="utf-8"?>
-<b:Sources xmlns:b="http://schemas.openxmlformats.org/officeDocument/2006/bibliography" xmlns="http://schemas.openxmlformats.org/officeDocument/2006/bibliography" SelectedStyle="\APASixthEditionOfficeOnline.xsl" StyleName="APA" Version="6"/>
+<file path=customXml/itemProps2.xml><?xml version="1.0" encoding="utf-8"?>
+<ds:datastoreItem xmlns:ds="http://schemas.openxmlformats.org/officeDocument/2006/customXml" ds:itemID="{79D0F40F-646A-4DBF-9119-0FC598DFBBBB}">
+  <ds:schemaRefs>
+    <ds:schemaRef ds:uri="http://schemas.microsoft.com/sharepoint/v3/contenttype/forms"/>
+  </ds:schemaRefs>
+</ds:datastoreItem>
 </file>
 
-<file path=customXml/itemProps1.xml><?xml version="1.0" encoding="utf-8"?>
+<file path=customXml/itemProps3.xml><?xml version="1.0" encoding="utf-8"?>
 <ds:datastoreItem xmlns:ds="http://schemas.openxmlformats.org/officeDocument/2006/customXml" ds:itemID="{E0E361D0-270A-43DD-B744-DC4991A38C53}">
   <ds:schemaRefs>
     <ds:schemaRef ds:uri="http://schemas.microsoft.com/office/2006/metadata/contentType"/>
@@ -12341,22 +13622,6 @@
 </ds:datastoreItem>
 </file>
 
-<file path=customXml/itemProps2.xml><?xml version="1.0" encoding="utf-8"?>
-<ds:datastoreItem xmlns:ds="http://schemas.openxmlformats.org/officeDocument/2006/customXml" ds:itemID="{79D0F40F-646A-4DBF-9119-0FC598DFBBBB}">
-  <ds:schemaRefs>
-    <ds:schemaRef ds:uri="http://schemas.microsoft.com/sharepoint/v3/contenttype/forms"/>
-  </ds:schemaRefs>
-</ds:datastoreItem>
-</file>
-
-<file path=customXml/itemProps3.xml><?xml version="1.0" encoding="utf-8"?>
-<ds:datastoreItem xmlns:ds="http://schemas.openxmlformats.org/officeDocument/2006/customXml" ds:itemID="{E9F6CDE2-636C-4043-AFFC-7CB0CE5DF55A}">
-  <ds:schemaRefs>
-    <ds:schemaRef ds:uri="http://schemas.openxmlformats.org/officeDocument/2006/bibliography"/>
-  </ds:schemaRefs>
-</ds:datastoreItem>
-</file>
-
 <file path=docMetadata/LabelInfo.xml><?xml version="1.0" encoding="utf-8"?>
 <clbl:labelList xmlns:clbl="http://schemas.microsoft.com/office/2020/mipLabelMetadata">
   <clbl:label id="{ff6dbec8-95a8-4638-9f5f-bd076536645c}" enabled="1" method="Standard" siteId="{5dbf1add-202a-4b8d-815b-bf0fb024e033}" contentBits="0" removed="0"/>

</xml_diff>

<commit_message>
Update scene xml and add GameUI picture
</commit_message>
<xml_diff>
--- a/document/Szakdolgozat.docx
+++ b/document/Szakdolgozat.docx
@@ -5018,14 +5018,27 @@
       <w:r>
         <w:t xml:space="preserve">ábra </w:t>
       </w:r>
-      <w:fldSimple w:instr=" SEQ ábra \* ARABIC ">
-        <w:r>
-          <w:rPr>
-            <w:noProof/>
-          </w:rPr>
-          <w:t>1</w:t>
-        </w:r>
-      </w:fldSimple>
+      <w:r>
+        <w:fldChar w:fldCharType="begin"/>
+      </w:r>
+      <w:r>
+        <w:instrText xml:space="preserve"> SEQ ábra \* ARABIC </w:instrText>
+      </w:r>
+      <w:r>
+        <w:fldChar w:fldCharType="separate"/>
+      </w:r>
+      <w:r>
+        <w:rPr>
+          <w:noProof/>
+        </w:rPr>
+        <w:t>1</w:t>
+      </w:r>
+      <w:r>
+        <w:rPr>
+          <w:noProof/>
+        </w:rPr>
+        <w:fldChar w:fldCharType="end"/>
+      </w:r>
       <w:r>
         <w:t xml:space="preserve">: </w:t>
       </w:r>
@@ -5919,14 +5932,27 @@
       <w:r>
         <w:t xml:space="preserve">ábra </w:t>
       </w:r>
-      <w:fldSimple w:instr=" SEQ ábra \* ARABIC ">
-        <w:r>
-          <w:rPr>
-            <w:noProof/>
-          </w:rPr>
-          <w:t>2</w:t>
-        </w:r>
-      </w:fldSimple>
+      <w:r>
+        <w:fldChar w:fldCharType="begin"/>
+      </w:r>
+      <w:r>
+        <w:instrText xml:space="preserve"> SEQ ábra \* ARABIC </w:instrText>
+      </w:r>
+      <w:r>
+        <w:fldChar w:fldCharType="separate"/>
+      </w:r>
+      <w:r>
+        <w:rPr>
+          <w:noProof/>
+        </w:rPr>
+        <w:t>2</w:t>
+      </w:r>
+      <w:r>
+        <w:rPr>
+          <w:noProof/>
+        </w:rPr>
+        <w:fldChar w:fldCharType="end"/>
+      </w:r>
       <w:r>
         <w:t>: A játékmotor fő osztályai</w:t>
       </w:r>
@@ -6196,14 +6222,27 @@
       <w:r>
         <w:t xml:space="preserve">ábra </w:t>
       </w:r>
-      <w:fldSimple w:instr=" SEQ ábra \* ARABIC ">
-        <w:r>
-          <w:rPr>
-            <w:noProof/>
-          </w:rPr>
-          <w:t>3</w:t>
-        </w:r>
-      </w:fldSimple>
+      <w:r>
+        <w:fldChar w:fldCharType="begin"/>
+      </w:r>
+      <w:r>
+        <w:instrText xml:space="preserve"> SEQ ábra \* ARABIC </w:instrText>
+      </w:r>
+      <w:r>
+        <w:fldChar w:fldCharType="separate"/>
+      </w:r>
+      <w:r>
+        <w:rPr>
+          <w:noProof/>
+        </w:rPr>
+        <w:t>3</w:t>
+      </w:r>
+      <w:r>
+        <w:rPr>
+          <w:noProof/>
+        </w:rPr>
+        <w:fldChar w:fldCharType="end"/>
+      </w:r>
       <w:r>
         <w:t>: A játékmotor különböző komponensei</w:t>
       </w:r>
@@ -6356,14 +6395,27 @@
       <w:r>
         <w:t xml:space="preserve">ábra </w:t>
       </w:r>
-      <w:fldSimple w:instr=" SEQ ábra \* ARABIC ">
-        <w:r>
-          <w:rPr>
-            <w:noProof/>
-          </w:rPr>
-          <w:t>4</w:t>
-        </w:r>
-      </w:fldSimple>
+      <w:r>
+        <w:fldChar w:fldCharType="begin"/>
+      </w:r>
+      <w:r>
+        <w:instrText xml:space="preserve"> SEQ ábra \* ARABIC </w:instrText>
+      </w:r>
+      <w:r>
+        <w:fldChar w:fldCharType="separate"/>
+      </w:r>
+      <w:r>
+        <w:rPr>
+          <w:noProof/>
+        </w:rPr>
+        <w:t>4</w:t>
+      </w:r>
+      <w:r>
+        <w:rPr>
+          <w:noProof/>
+        </w:rPr>
+        <w:fldChar w:fldCharType="end"/>
+      </w:r>
       <w:r>
         <w:t>: Scene osztállyal kapcsolatos osztályok</w:t>
       </w:r>
@@ -6645,14 +6697,27 @@
       <w:r>
         <w:t xml:space="preserve">ábra </w:t>
       </w:r>
-      <w:fldSimple w:instr=" SEQ ábra \* ARABIC ">
-        <w:r>
-          <w:rPr>
-            <w:noProof/>
-          </w:rPr>
-          <w:t>5</w:t>
-        </w:r>
-      </w:fldSimple>
+      <w:r>
+        <w:fldChar w:fldCharType="begin"/>
+      </w:r>
+      <w:r>
+        <w:instrText xml:space="preserve"> SEQ ábra \* ARABIC </w:instrText>
+      </w:r>
+      <w:r>
+        <w:fldChar w:fldCharType="separate"/>
+      </w:r>
+      <w:r>
+        <w:rPr>
+          <w:noProof/>
+        </w:rPr>
+        <w:t>5</w:t>
+      </w:r>
+      <w:r>
+        <w:rPr>
+          <w:noProof/>
+        </w:rPr>
+        <w:fldChar w:fldCharType="end"/>
+      </w:r>
       <w:r>
         <w:t>: A Scene kirajzolható objektumainak struktúrája</w:t>
       </w:r>
@@ -6849,14 +6914,27 @@
       <w:r>
         <w:t xml:space="preserve">ábra </w:t>
       </w:r>
-      <w:fldSimple w:instr=" SEQ ábra \* ARABIC ">
-        <w:r>
-          <w:rPr>
-            <w:noProof/>
-          </w:rPr>
-          <w:t>6</w:t>
-        </w:r>
-      </w:fldSimple>
+      <w:r>
+        <w:fldChar w:fldCharType="begin"/>
+      </w:r>
+      <w:r>
+        <w:instrText xml:space="preserve"> SEQ ábra \* ARABIC </w:instrText>
+      </w:r>
+      <w:r>
+        <w:fldChar w:fldCharType="separate"/>
+      </w:r>
+      <w:r>
+        <w:rPr>
+          <w:noProof/>
+        </w:rPr>
+        <w:t>6</w:t>
+      </w:r>
+      <w:r>
+        <w:rPr>
+          <w:noProof/>
+        </w:rPr>
+        <w:fldChar w:fldCharType="end"/>
+      </w:r>
       <w:r>
         <w:t>: A játék logika főegysége</w:t>
       </w:r>
@@ -7040,14 +7118,27 @@
       <w:r>
         <w:t xml:space="preserve">ábra </w:t>
       </w:r>
-      <w:fldSimple w:instr=" SEQ ábra \* ARABIC ">
-        <w:r>
-          <w:rPr>
-            <w:noProof/>
-          </w:rPr>
-          <w:t>7</w:t>
-        </w:r>
-      </w:fldSimple>
+      <w:r>
+        <w:fldChar w:fldCharType="begin"/>
+      </w:r>
+      <w:r>
+        <w:instrText xml:space="preserve"> SEQ ábra \* ARABIC </w:instrText>
+      </w:r>
+      <w:r>
+        <w:fldChar w:fldCharType="separate"/>
+      </w:r>
+      <w:r>
+        <w:rPr>
+          <w:noProof/>
+        </w:rPr>
+        <w:t>7</w:t>
+      </w:r>
+      <w:r>
+        <w:rPr>
+          <w:noProof/>
+        </w:rPr>
+        <w:fldChar w:fldCharType="end"/>
+      </w:r>
       <w:r>
         <w:t>: Játék vezérlést elősegítő handlerek</w:t>
       </w:r>
@@ -7358,14 +7449,27 @@
       <w:r>
         <w:t xml:space="preserve">ábra </w:t>
       </w:r>
-      <w:fldSimple w:instr=" SEQ ábra \* ARABIC ">
-        <w:r>
-          <w:rPr>
-            <w:noProof/>
-          </w:rPr>
-          <w:t>8</w:t>
-        </w:r>
-      </w:fldSimple>
+      <w:r>
+        <w:fldChar w:fldCharType="begin"/>
+      </w:r>
+      <w:r>
+        <w:instrText xml:space="preserve"> SEQ ábra \* ARABIC </w:instrText>
+      </w:r>
+      <w:r>
+        <w:fldChar w:fldCharType="separate"/>
+      </w:r>
+      <w:r>
+        <w:rPr>
+          <w:noProof/>
+        </w:rPr>
+        <w:t>8</w:t>
+      </w:r>
+      <w:r>
+        <w:rPr>
+          <w:noProof/>
+        </w:rPr>
+        <w:fldChar w:fldCharType="end"/>
+      </w:r>
       <w:r>
         <w:t>: Korok reprezentációja</w:t>
       </w:r>
@@ -7453,14 +7557,27 @@
       <w:r>
         <w:t xml:space="preserve">ábra </w:t>
       </w:r>
-      <w:fldSimple w:instr=" SEQ ábra \* ARABIC ">
-        <w:r>
-          <w:rPr>
-            <w:noProof/>
-          </w:rPr>
-          <w:t>9</w:t>
-        </w:r>
-      </w:fldSimple>
+      <w:r>
+        <w:fldChar w:fldCharType="begin"/>
+      </w:r>
+      <w:r>
+        <w:instrText xml:space="preserve"> SEQ ábra \* ARABIC </w:instrText>
+      </w:r>
+      <w:r>
+        <w:fldChar w:fldCharType="separate"/>
+      </w:r>
+      <w:r>
+        <w:rPr>
+          <w:noProof/>
+        </w:rPr>
+        <w:t>9</w:t>
+      </w:r>
+      <w:r>
+        <w:rPr>
+          <w:noProof/>
+        </w:rPr>
+        <w:fldChar w:fldCharType="end"/>
+      </w:r>
       <w:r>
         <w:t>: Játékelemek reprezentációja osztályokkal</w:t>
       </w:r>
@@ -7567,14 +7684,27 @@
       <w:r>
         <w:t xml:space="preserve">ábra </w:t>
       </w:r>
-      <w:fldSimple w:instr=" SEQ ábra \* ARABIC ">
-        <w:r>
-          <w:rPr>
-            <w:noProof/>
-          </w:rPr>
-          <w:t>10</w:t>
-        </w:r>
-      </w:fldSimple>
+      <w:r>
+        <w:fldChar w:fldCharType="begin"/>
+      </w:r>
+      <w:r>
+        <w:instrText xml:space="preserve"> SEQ ábra \* ARABIC </w:instrText>
+      </w:r>
+      <w:r>
+        <w:fldChar w:fldCharType="separate"/>
+      </w:r>
+      <w:r>
+        <w:rPr>
+          <w:noProof/>
+        </w:rPr>
+        <w:t>10</w:t>
+      </w:r>
+      <w:r>
+        <w:rPr>
+          <w:noProof/>
+        </w:rPr>
+        <w:fldChar w:fldCharType="end"/>
+      </w:r>
       <w:r>
         <w:t>: Játékelemek generálását segítő osztályok</w:t>
       </w:r>
@@ -7708,14 +7838,27 @@
       <w:r>
         <w:t xml:space="preserve">ábra </w:t>
       </w:r>
-      <w:fldSimple w:instr=" SEQ ábra \* ARABIC ">
-        <w:r>
-          <w:rPr>
-            <w:noProof/>
-          </w:rPr>
-          <w:t>11</w:t>
-        </w:r>
-      </w:fldSimple>
+      <w:r>
+        <w:fldChar w:fldCharType="begin"/>
+      </w:r>
+      <w:r>
+        <w:instrText xml:space="preserve"> SEQ ábra \* ARABIC </w:instrText>
+      </w:r>
+      <w:r>
+        <w:fldChar w:fldCharType="separate"/>
+      </w:r>
+      <w:r>
+        <w:rPr>
+          <w:noProof/>
+        </w:rPr>
+        <w:t>11</w:t>
+      </w:r>
+      <w:r>
+        <w:rPr>
+          <w:noProof/>
+        </w:rPr>
+        <w:fldChar w:fldCharType="end"/>
+      </w:r>
       <w:r>
         <w:t>: Kártya kompozíciót reprezentáló osztályok</w:t>
       </w:r>
@@ -7810,14 +7953,27 @@
       <w:r>
         <w:t xml:space="preserve">ábra </w:t>
       </w:r>
-      <w:fldSimple w:instr=" SEQ ábra \* ARABIC ">
-        <w:r>
-          <w:rPr>
-            <w:noProof/>
-          </w:rPr>
-          <w:t>12</w:t>
-        </w:r>
-      </w:fldSimple>
+      <w:r>
+        <w:fldChar w:fldCharType="begin"/>
+      </w:r>
+      <w:r>
+        <w:instrText xml:space="preserve"> SEQ ábra \* ARABIC </w:instrText>
+      </w:r>
+      <w:r>
+        <w:fldChar w:fldCharType="separate"/>
+      </w:r>
+      <w:r>
+        <w:rPr>
+          <w:noProof/>
+        </w:rPr>
+        <w:t>12</w:t>
+      </w:r>
+      <w:r>
+        <w:rPr>
+          <w:noProof/>
+        </w:rPr>
+        <w:fldChar w:fldCharType="end"/>
+      </w:r>
       <w:r>
         <w:t>: Külsőleg használt interfészek és osztályok</w:t>
       </w:r>
@@ -8000,14 +8156,27 @@
       <w:r>
         <w:t xml:space="preserve">ábra </w:t>
       </w:r>
-      <w:fldSimple w:instr=" SEQ ábra \* ARABIC ">
-        <w:r>
-          <w:rPr>
-            <w:noProof/>
-          </w:rPr>
-          <w:t>13</w:t>
-        </w:r>
-      </w:fldSimple>
+      <w:r>
+        <w:fldChar w:fldCharType="begin"/>
+      </w:r>
+      <w:r>
+        <w:instrText xml:space="preserve"> SEQ ábra \* ARABIC </w:instrText>
+      </w:r>
+      <w:r>
+        <w:fldChar w:fldCharType="separate"/>
+      </w:r>
+      <w:r>
+        <w:rPr>
+          <w:noProof/>
+        </w:rPr>
+        <w:t>13</w:t>
+      </w:r>
+      <w:r>
+        <w:rPr>
+          <w:noProof/>
+        </w:rPr>
+        <w:fldChar w:fldCharType="end"/>
+      </w:r>
       <w:r>
         <w:t>: A gépi játékos reprezentációja és az ahhoz kapcsolódó interfészek</w:t>
       </w:r>
@@ -8130,14 +8299,27 @@
       <w:r>
         <w:t xml:space="preserve">ábra </w:t>
       </w:r>
-      <w:fldSimple w:instr=" SEQ ábra \* ARABIC ">
-        <w:r>
-          <w:rPr>
-            <w:noProof/>
-          </w:rPr>
-          <w:t>14</w:t>
-        </w:r>
-      </w:fldSimple>
+      <w:r>
+        <w:fldChar w:fldCharType="begin"/>
+      </w:r>
+      <w:r>
+        <w:instrText xml:space="preserve"> SEQ ábra \* ARABIC </w:instrText>
+      </w:r>
+      <w:r>
+        <w:fldChar w:fldCharType="separate"/>
+      </w:r>
+      <w:r>
+        <w:rPr>
+          <w:noProof/>
+        </w:rPr>
+        <w:t>14</w:t>
+      </w:r>
+      <w:r>
+        <w:rPr>
+          <w:noProof/>
+        </w:rPr>
+        <w:fldChar w:fldCharType="end"/>
+      </w:r>
       <w:r>
         <w:t>: Különböző döntéseket kezelő osztályok és a súlyokat tartalmazó osztály reprezentációja</w:t>
       </w:r>
@@ -8226,14 +8408,27 @@
       <w:r>
         <w:t xml:space="preserve">ábra </w:t>
       </w:r>
-      <w:fldSimple w:instr=" SEQ ábra \* ARABIC ">
-        <w:r>
-          <w:rPr>
-            <w:noProof/>
-          </w:rPr>
-          <w:t>15</w:t>
-        </w:r>
-      </w:fldSimple>
+      <w:r>
+        <w:fldChar w:fldCharType="begin"/>
+      </w:r>
+      <w:r>
+        <w:instrText xml:space="preserve"> SEQ ábra \* ARABIC </w:instrText>
+      </w:r>
+      <w:r>
+        <w:fldChar w:fldCharType="separate"/>
+      </w:r>
+      <w:r>
+        <w:rPr>
+          <w:noProof/>
+        </w:rPr>
+        <w:t>15</w:t>
+      </w:r>
+      <w:r>
+        <w:rPr>
+          <w:noProof/>
+        </w:rPr>
+        <w:fldChar w:fldCharType="end"/>
+      </w:r>
       <w:r>
         <w:t>: A mesterséges intelligenciának információt szolgáltató interfészek, osztályok</w:t>
       </w:r>
@@ -8759,14 +8954,27 @@
       <w:r>
         <w:t xml:space="preserve">ábra </w:t>
       </w:r>
-      <w:fldSimple w:instr=" SEQ ábra \* ARABIC ">
-        <w:r>
-          <w:rPr>
-            <w:noProof/>
-          </w:rPr>
-          <w:t>16</w:t>
-        </w:r>
-      </w:fldSimple>
+      <w:r>
+        <w:fldChar w:fldCharType="begin"/>
+      </w:r>
+      <w:r>
+        <w:instrText xml:space="preserve"> SEQ ábra \* ARABIC </w:instrText>
+      </w:r>
+      <w:r>
+        <w:fldChar w:fldCharType="separate"/>
+      </w:r>
+      <w:r>
+        <w:rPr>
+          <w:noProof/>
+        </w:rPr>
+        <w:t>16</w:t>
+      </w:r>
+      <w:r>
+        <w:rPr>
+          <w:noProof/>
+        </w:rPr>
+        <w:fldChar w:fldCharType="end"/>
+      </w:r>
       <w:r>
         <w:t>: Szerver oldali üzenetküldéssel kapcsolatos osztályok, interfészek</w:t>
       </w:r>
@@ -8861,14 +9069,27 @@
       <w:r>
         <w:t xml:space="preserve">ábra </w:t>
       </w:r>
-      <w:fldSimple w:instr=" SEQ ábra \* ARABIC ">
-        <w:r>
-          <w:rPr>
-            <w:noProof/>
-          </w:rPr>
-          <w:t>17</w:t>
-        </w:r>
-      </w:fldSimple>
+      <w:r>
+        <w:fldChar w:fldCharType="begin"/>
+      </w:r>
+      <w:r>
+        <w:instrText xml:space="preserve"> SEQ ábra \* ARABIC </w:instrText>
+      </w:r>
+      <w:r>
+        <w:fldChar w:fldCharType="separate"/>
+      </w:r>
+      <w:r>
+        <w:rPr>
+          <w:noProof/>
+        </w:rPr>
+        <w:t>17</w:t>
+      </w:r>
+      <w:r>
+        <w:rPr>
+          <w:noProof/>
+        </w:rPr>
+        <w:fldChar w:fldCharType="end"/>
+      </w:r>
       <w:r>
         <w:t>: A klienseket reprezentáló és kezelő osztályok szerver oldalon</w:t>
       </w:r>
@@ -9108,14 +9329,27 @@
       <w:r>
         <w:t xml:space="preserve">ábra </w:t>
       </w:r>
-      <w:fldSimple w:instr=" SEQ ábra \* ARABIC ">
-        <w:r>
-          <w:rPr>
-            <w:noProof/>
-          </w:rPr>
-          <w:t>18</w:t>
-        </w:r>
-      </w:fldSimple>
+      <w:r>
+        <w:fldChar w:fldCharType="begin"/>
+      </w:r>
+      <w:r>
+        <w:instrText xml:space="preserve"> SEQ ábra \* ARABIC </w:instrText>
+      </w:r>
+      <w:r>
+        <w:fldChar w:fldCharType="separate"/>
+      </w:r>
+      <w:r>
+        <w:rPr>
+          <w:noProof/>
+        </w:rPr>
+        <w:t>18</w:t>
+      </w:r>
+      <w:r>
+        <w:rPr>
+          <w:noProof/>
+        </w:rPr>
+        <w:fldChar w:fldCharType="end"/>
+      </w:r>
       <w:r>
         <w:t>: Üzenet szétosztást megvalósító osztályok, interfészek</w:t>
       </w:r>
@@ -9234,14 +9468,27 @@
       <w:r>
         <w:t xml:space="preserve">ábra </w:t>
       </w:r>
-      <w:fldSimple w:instr=" SEQ ábra \* ARABIC ">
-        <w:r>
-          <w:rPr>
-            <w:noProof/>
-          </w:rPr>
-          <w:t>19</w:t>
-        </w:r>
-      </w:fldSimple>
+      <w:r>
+        <w:fldChar w:fldCharType="begin"/>
+      </w:r>
+      <w:r>
+        <w:instrText xml:space="preserve"> SEQ ábra \* ARABIC </w:instrText>
+      </w:r>
+      <w:r>
+        <w:fldChar w:fldCharType="separate"/>
+      </w:r>
+      <w:r>
+        <w:rPr>
+          <w:noProof/>
+        </w:rPr>
+        <w:t>19</w:t>
+      </w:r>
+      <w:r>
+        <w:rPr>
+          <w:noProof/>
+        </w:rPr>
+        <w:fldChar w:fldCharType="end"/>
+      </w:r>
       <w:r>
         <w:t>: Lobby kezeléssel kapcsolatos osztályok</w:t>
       </w:r>
@@ -9452,14 +9699,27 @@
       <w:r>
         <w:t xml:space="preserve">ábra </w:t>
       </w:r>
-      <w:fldSimple w:instr=" SEQ ábra \* ARABIC ">
-        <w:r>
-          <w:rPr>
-            <w:noProof/>
-          </w:rPr>
-          <w:t>20</w:t>
-        </w:r>
-      </w:fldSimple>
+      <w:r>
+        <w:fldChar w:fldCharType="begin"/>
+      </w:r>
+      <w:r>
+        <w:instrText xml:space="preserve"> SEQ ábra \* ARABIC </w:instrText>
+      </w:r>
+      <w:r>
+        <w:fldChar w:fldCharType="separate"/>
+      </w:r>
+      <w:r>
+        <w:rPr>
+          <w:noProof/>
+        </w:rPr>
+        <w:t>20</w:t>
+      </w:r>
+      <w:r>
+        <w:rPr>
+          <w:noProof/>
+        </w:rPr>
+        <w:fldChar w:fldCharType="end"/>
+      </w:r>
       <w:r>
         <w:t>: Több játékmenet kezelésével kapcsolatos osztályok</w:t>
       </w:r>
@@ -10283,14 +10543,27 @@
       <w:r>
         <w:t xml:space="preserve">ábra </w:t>
       </w:r>
-      <w:fldSimple w:instr=" SEQ ábra \* ARABIC ">
-        <w:r>
-          <w:rPr>
-            <w:noProof/>
-          </w:rPr>
-          <w:t>21</w:t>
-        </w:r>
-      </w:fldSimple>
+      <w:r>
+        <w:fldChar w:fldCharType="begin"/>
+      </w:r>
+      <w:r>
+        <w:instrText xml:space="preserve"> SEQ ábra \* ARABIC </w:instrText>
+      </w:r>
+      <w:r>
+        <w:fldChar w:fldCharType="separate"/>
+      </w:r>
+      <w:r>
+        <w:rPr>
+          <w:noProof/>
+        </w:rPr>
+        <w:t>21</w:t>
+      </w:r>
+      <w:r>
+        <w:rPr>
+          <w:noProof/>
+        </w:rPr>
+        <w:fldChar w:fldCharType="end"/>
+      </w:r>
       <w:r>
         <w:t>: A könnyű szintű MI átlagos jutalom szerzése</w:t>
       </w:r>
@@ -10491,14 +10764,27 @@
       <w:r>
         <w:t xml:space="preserve">ábra </w:t>
       </w:r>
-      <w:fldSimple w:instr=" SEQ ábra \* ARABIC ">
-        <w:r>
-          <w:rPr>
-            <w:noProof/>
-          </w:rPr>
-          <w:t>22</w:t>
-        </w:r>
-      </w:fldSimple>
+      <w:r>
+        <w:fldChar w:fldCharType="begin"/>
+      </w:r>
+      <w:r>
+        <w:instrText xml:space="preserve"> SEQ ábra \* ARABIC </w:instrText>
+      </w:r>
+      <w:r>
+        <w:fldChar w:fldCharType="separate"/>
+      </w:r>
+      <w:r>
+        <w:rPr>
+          <w:noProof/>
+        </w:rPr>
+        <w:t>22</w:t>
+      </w:r>
+      <w:r>
+        <w:rPr>
+          <w:noProof/>
+        </w:rPr>
+        <w:fldChar w:fldCharType="end"/>
+      </w:r>
       <w:r>
         <w:t xml:space="preserve">: </w:t>
       </w:r>
@@ -10520,14 +10806,27 @@
       <w:r>
         <w:t xml:space="preserve">táblázat </w:t>
       </w:r>
-      <w:fldSimple w:instr=" SEQ táblázat \* ARABIC ">
-        <w:r>
-          <w:rPr>
-            <w:noProof/>
-          </w:rPr>
-          <w:t>1</w:t>
-        </w:r>
-      </w:fldSimple>
+      <w:r>
+        <w:fldChar w:fldCharType="begin"/>
+      </w:r>
+      <w:r>
+        <w:instrText xml:space="preserve"> SEQ táblázat \* ARABIC </w:instrText>
+      </w:r>
+      <w:r>
+        <w:fldChar w:fldCharType="separate"/>
+      </w:r>
+      <w:r>
+        <w:rPr>
+          <w:noProof/>
+        </w:rPr>
+        <w:t>1</w:t>
+      </w:r>
+      <w:r>
+        <w:rPr>
+          <w:noProof/>
+        </w:rPr>
+        <w:fldChar w:fldCharType="end"/>
+      </w:r>
       <w:r>
         <w:t>: Közepes szintű ágens tanítási fázisainak konfigurációja</w:t>
       </w:r>
@@ -11172,69 +11471,55 @@
           <w:lang w:val="en-GB" w:eastAsia="zh-CN"/>
         </w:rPr>
       </w:pPr>
-    </w:p>
-    <w:p>
-      <w:pPr>
+      <w:r>
         <w:rPr>
           <w:lang w:val="en-GB" w:eastAsia="zh-CN"/>
         </w:rPr>
-      </w:pPr>
+        <w:t>A közepes szintű ágens tanítása több szakaszban, iteratív módon történt</w:t>
+      </w:r>
       <w:r>
         <w:rPr>
           <w:lang w:val="en-GB" w:eastAsia="zh-CN"/>
         </w:rPr>
-        <w:t>A közepes szintű ágens tanítása több szakaszban, iteratív módon történt</w:t>
+        <w:t xml:space="preserve">. </w:t>
       </w:r>
       <w:r>
         <w:rPr>
           <w:lang w:val="en-GB" w:eastAsia="zh-CN"/>
         </w:rPr>
-        <w:t xml:space="preserve">. </w:t>
+        <w:t>Jól megfigyelhető, hogy az egyes fázisok közötti átmenetkor a jutalomérték hirtelen visszaesett. Ez a</w:t>
       </w:r>
       <w:r>
         <w:rPr>
           <w:lang w:val="en-GB" w:eastAsia="zh-CN"/>
         </w:rPr>
-        <w:t>Jól megfigyelhető, hogy az egyes fázisok közötti átmenetkor a jutalomérték hirtelen visszaesett. Ez a</w:t>
+        <w:t xml:space="preserve">z ellenfél elosztások változtatásával </w:t>
       </w:r>
       <w:r>
         <w:rPr>
           <w:lang w:val="en-GB" w:eastAsia="zh-CN"/>
         </w:rPr>
-        <w:t xml:space="preserve">z ellenfél elosztások változtatásával </w:t>
-      </w:r>
-      <w:r>
+        <w:t>magyarázható.</w:t>
+      </w:r>
+    </w:p>
+    <w:p>
+      <w:pPr>
         <w:rPr>
           <w:lang w:val="en-GB" w:eastAsia="zh-CN"/>
         </w:rPr>
-        <w:t>magyarázható.</w:t>
-      </w:r>
-    </w:p>
-    <w:p>
-      <w:pPr>
+      </w:pPr>
+      <w:r>
         <w:rPr>
           <w:lang w:val="en-GB" w:eastAsia="zh-CN"/>
         </w:rPr>
-      </w:pPr>
+        <w:t>A görbék alakzata azonban igazolja a modell robusztusságát: a kezdeti teljesítménycsökkenés után az ágens minden fázisban képes volt adaptálódni és újra növekvő tendenciát mutatni. A tanítás utolsó szakaszában a jutalomérték stabilizálódott, ami a hálózat sikeres konvergenciáját jelzi az optimalizált, tömörített állapotreprezentáció</w:t>
+      </w:r>
       <w:r>
         <w:rPr>
           <w:lang w:val="en-GB" w:eastAsia="zh-CN"/>
         </w:rPr>
-        <w:t>A görbék alakzata azonban igazolja a modell robusztusságát: a kezdeti teljesítménycsökkenés után az ágens minden fázisban képes volt adaptálódni és újra növekvő tendenciát mutatni. A tanítás utolsó szakaszában a jutalomérték stabilizálódott, ami a hálózat sikeres konvergenciáját jelzi az optimalizált, tömörített állapotreprezentáció</w:t>
-      </w:r>
-      <w:r>
-        <w:rPr>
-          <w:lang w:val="en-GB" w:eastAsia="zh-CN"/>
-        </w:rPr>
         <w:t>.</w:t>
       </w:r>
-    </w:p>
-    <w:p>
-      <w:pPr>
-        <w:rPr>
-          <w:lang w:val="en-GB" w:eastAsia="zh-CN"/>
-        </w:rPr>
-      </w:pPr>
     </w:p>
     <w:p>
       <w:pPr>
@@ -11342,14 +11627,27 @@
       <w:r>
         <w:t xml:space="preserve">ábra </w:t>
       </w:r>
-      <w:fldSimple w:instr=" SEQ ábra \* ARABIC ">
-        <w:r>
-          <w:rPr>
-            <w:noProof/>
-          </w:rPr>
-          <w:t>23</w:t>
-        </w:r>
-      </w:fldSimple>
+      <w:r>
+        <w:fldChar w:fldCharType="begin"/>
+      </w:r>
+      <w:r>
+        <w:instrText xml:space="preserve"> SEQ ábra \* ARABIC </w:instrText>
+      </w:r>
+      <w:r>
+        <w:fldChar w:fldCharType="separate"/>
+      </w:r>
+      <w:r>
+        <w:rPr>
+          <w:noProof/>
+        </w:rPr>
+        <w:t>23</w:t>
+      </w:r>
+      <w:r>
+        <w:rPr>
+          <w:noProof/>
+        </w:rPr>
+        <w:fldChar w:fldCharType="end"/>
+      </w:r>
       <w:r>
         <w:t xml:space="preserve">: </w:t>
       </w:r>
@@ -11371,14 +11669,27 @@
       <w:r>
         <w:t xml:space="preserve">táblázat </w:t>
       </w:r>
-      <w:fldSimple w:instr=" SEQ táblázat \* ARABIC ">
-        <w:r>
-          <w:rPr>
-            <w:noProof/>
-          </w:rPr>
-          <w:t>2</w:t>
-        </w:r>
-      </w:fldSimple>
+      <w:r>
+        <w:fldChar w:fldCharType="begin"/>
+      </w:r>
+      <w:r>
+        <w:instrText xml:space="preserve"> SEQ táblázat \* ARABIC </w:instrText>
+      </w:r>
+      <w:r>
+        <w:fldChar w:fldCharType="separate"/>
+      </w:r>
+      <w:r>
+        <w:rPr>
+          <w:noProof/>
+        </w:rPr>
+        <w:t>2</w:t>
+      </w:r>
+      <w:r>
+        <w:rPr>
+          <w:noProof/>
+        </w:rPr>
+        <w:fldChar w:fldCharType="end"/>
+      </w:r>
       <w:r>
         <w:t>: Nehéz szintű ágens tanítási fázisainak konfigurációja</w:t>
       </w:r>
@@ -12047,14 +12358,27 @@
         <w:lastRenderedPageBreak/>
         <w:t xml:space="preserve">táblázat </w:t>
       </w:r>
-      <w:fldSimple w:instr=" SEQ táblázat \* ARABIC ">
-        <w:r>
-          <w:rPr>
-            <w:noProof/>
-          </w:rPr>
-          <w:t>3</w:t>
-        </w:r>
-      </w:fldSimple>
+      <w:r>
+        <w:fldChar w:fldCharType="begin"/>
+      </w:r>
+      <w:r>
+        <w:instrText xml:space="preserve"> SEQ táblázat \* ARABIC </w:instrText>
+      </w:r>
+      <w:r>
+        <w:fldChar w:fldCharType="separate"/>
+      </w:r>
+      <w:r>
+        <w:rPr>
+          <w:noProof/>
+        </w:rPr>
+        <w:t>3</w:t>
+      </w:r>
+      <w:r>
+        <w:rPr>
+          <w:noProof/>
+        </w:rPr>
+        <w:fldChar w:fldCharType="end"/>
+      </w:r>
       <w:r>
         <w:t>: Egyes nehézségi szinteken elért teljesítmény-mutatók összefoglaló kiértékelése</w:t>
       </w:r>
@@ -12903,6 +13227,251 @@
         </w:numPr>
         <w:ind w:left="567" w:hanging="567"/>
       </w:pPr>
+      <w:r>
+        <w:t xml:space="preserve">Microsoft Corporation, "What is .NET MAUI? - .NET MAUI," </w:t>
+      </w:r>
+      <w:r>
+        <w:rPr>
+          <w:i/>
+          <w:iCs/>
+        </w:rPr>
+        <w:t>Microsoft Learn</w:t>
+      </w:r>
+      <w:r>
+        <w:t xml:space="preserve">, 2024. [Online]. Elérhető: </w:t>
+      </w:r>
+      <w:hyperlink r:id="rId35" w:tgtFrame="_blank" w:history="1">
+        <w:r>
+          <w:rPr>
+            <w:rStyle w:val="Hyperlink"/>
+          </w:rPr>
+          <w:t>https://learn.microsoft.com/en-us/dotnet/maui/what-is-maui</w:t>
+        </w:r>
+      </w:hyperlink>
+      <w:r>
+        <w:t>. [Hozzáférés: 2024. április].</w:t>
+      </w:r>
+    </w:p>
+    <w:p>
+      <w:pPr>
+        <w:pStyle w:val="ListParagraph"/>
+        <w:numPr>
+          <w:ilvl w:val="0"/>
+          <w:numId w:val="2"/>
+        </w:numPr>
+        <w:ind w:left="567" w:hanging="567"/>
+      </w:pPr>
+      <w:r>
+        <w:t xml:space="preserve">Microsoft Corporation, "Introduction to ASP.NET Core SignalR," </w:t>
+      </w:r>
+      <w:r>
+        <w:rPr>
+          <w:i/>
+          <w:iCs/>
+        </w:rPr>
+        <w:t>Microsoft Learn</w:t>
+      </w:r>
+      <w:r>
+        <w:t xml:space="preserve">, 2023. [Online]. Elérhető: </w:t>
+      </w:r>
+      <w:hyperlink r:id="rId36" w:tgtFrame="_blank" w:history="1">
+        <w:r>
+          <w:rPr>
+            <w:rStyle w:val="Hyperlink"/>
+          </w:rPr>
+          <w:t>https://learn.microsoft.com/en-us/aspnet/core/signalr/introduction</w:t>
+        </w:r>
+      </w:hyperlink>
+      <w:r>
+        <w:t>. [Hozzáférés: 2024. április]</w:t>
+      </w:r>
+      <w:r>
+        <w:t>.</w:t>
+      </w:r>
+    </w:p>
+    <w:p>
+      <w:pPr>
+        <w:pStyle w:val="ListParagraph"/>
+        <w:numPr>
+          <w:ilvl w:val="0"/>
+          <w:numId w:val="2"/>
+        </w:numPr>
+        <w:ind w:left="567" w:hanging="567"/>
+      </w:pPr>
+      <w:r>
+        <w:t xml:space="preserve">Mono Project, "SkiaSharp - 2D Cross-Platform Graphics API," </w:t>
+      </w:r>
+      <w:r>
+        <w:rPr>
+          <w:i/>
+          <w:iCs/>
+        </w:rPr>
+        <w:t>Microsoft Learn</w:t>
+      </w:r>
+      <w:r>
+        <w:t xml:space="preserve">, 2023. [Online]. Elérhető: </w:t>
+      </w:r>
+      <w:hyperlink r:id="rId37" w:tgtFrame="_blank" w:history="1">
+        <w:r>
+          <w:rPr>
+            <w:rStyle w:val="Hyperlink"/>
+          </w:rPr>
+          <w:t>https://learn.microsoft.com/en-us/dotnet/api/skiasharp</w:t>
+        </w:r>
+      </w:hyperlink>
+      <w:r>
+        <w:t>. [Hozzáférés: 2024. április].</w:t>
+      </w:r>
+    </w:p>
+    <w:p>
+      <w:pPr>
+        <w:pStyle w:val="ListParagraph"/>
+        <w:numPr>
+          <w:ilvl w:val="0"/>
+          <w:numId w:val="2"/>
+        </w:numPr>
+        <w:ind w:left="567" w:hanging="567"/>
+      </w:pPr>
+      <w:r>
+        <w:t xml:space="preserve">Microsoft Corporation, "What is ML.NET?," </w:t>
+      </w:r>
+      <w:r>
+        <w:rPr>
+          <w:i/>
+          <w:iCs/>
+        </w:rPr>
+        <w:t>Microsoft Learn</w:t>
+      </w:r>
+      <w:r>
+        <w:t xml:space="preserve">, 2023. [Online]. Elérhető: </w:t>
+      </w:r>
+      <w:hyperlink r:id="rId38" w:tgtFrame="_blank" w:history="1">
+        <w:r>
+          <w:rPr>
+            <w:rStyle w:val="Hyperlink"/>
+          </w:rPr>
+          <w:t>https://learn.microsoft.com/en-us/dotnet/machine-learning/how-does-mldotnet-work</w:t>
+        </w:r>
+      </w:hyperlink>
+      <w:r>
+        <w:t>. [Hozzáférés: 2024. április].</w:t>
+      </w:r>
+    </w:p>
+    <w:p>
+      <w:pPr>
+        <w:pStyle w:val="ListParagraph"/>
+        <w:numPr>
+          <w:ilvl w:val="0"/>
+          <w:numId w:val="2"/>
+        </w:numPr>
+        <w:ind w:left="567" w:hanging="567"/>
+      </w:pPr>
+      <w:r>
+        <w:t>A. Raffin, A. Hill, A. Gleave, A. Kanervisto, M. Ernestus, és N. Dormann, "Stable-Baselines3</w:t>
+      </w:r>
+      <w:r>
+        <w:t xml:space="preserve"> Docs -</w:t>
+      </w:r>
+      <w:r>
+        <w:t xml:space="preserve"> Reliable Reinforcement Learning Implementations,"</w:t>
+      </w:r>
+      <w:r>
+        <w:t xml:space="preserve"> </w:t>
+      </w:r>
+      <w:r>
+        <w:t>[Online]. Elérhető:</w:t>
+      </w:r>
+      <w:r>
+        <w:t xml:space="preserve"> </w:t>
+      </w:r>
+      <w:hyperlink r:id="rId39" w:history="1">
+        <w:r>
+          <w:rPr>
+            <w:rStyle w:val="Hyperlink"/>
+          </w:rPr>
+          <w:t>Stable-Baselines3 Docs - Reliable Reinforcement Learning Implementations — Stable Baselines3 2.9.0a2 documentation</w:t>
+        </w:r>
+      </w:hyperlink>
+    </w:p>
+    <w:p>
+      <w:pPr>
+        <w:pStyle w:val="ListParagraph"/>
+        <w:numPr>
+          <w:ilvl w:val="0"/>
+          <w:numId w:val="2"/>
+        </w:numPr>
+        <w:ind w:left="567" w:hanging="567"/>
+      </w:pPr>
+      <w:r>
+        <w:t xml:space="preserve">E. Gamma, R. Helm, R. Johnson, és J. Vlissides, </w:t>
+      </w:r>
+      <w:r>
+        <w:rPr>
+          <w:i/>
+          <w:iCs/>
+        </w:rPr>
+        <w:t>Design Patterns: Elements of Reusable Object-Oriented Software</w:t>
+      </w:r>
+      <w:r>
+        <w:t>. Reading, MA: Addison-Wesley, 1994.</w:t>
+      </w:r>
+    </w:p>
+    <w:p>
+      <w:pPr>
+        <w:pStyle w:val="ListParagraph"/>
+        <w:numPr>
+          <w:ilvl w:val="0"/>
+          <w:numId w:val="2"/>
+        </w:numPr>
+        <w:ind w:left="567" w:hanging="567"/>
+      </w:pPr>
+      <w:r>
+        <w:t xml:space="preserve">M. Seemann és M. van Deursen, </w:t>
+      </w:r>
+      <w:r>
+        <w:rPr>
+          <w:i/>
+          <w:iCs/>
+        </w:rPr>
+        <w:t>Dependency Injection Principles, Practices, and Patterns</w:t>
+      </w:r>
+      <w:r>
+        <w:t>. Shelter Island, NY: Manning Publications, 2019.</w:t>
+      </w:r>
+    </w:p>
+    <w:p>
+      <w:pPr>
+        <w:pStyle w:val="ListParagraph"/>
+        <w:numPr>
+          <w:ilvl w:val="0"/>
+          <w:numId w:val="2"/>
+        </w:numPr>
+        <w:ind w:left="567" w:hanging="567"/>
+      </w:pPr>
+      <w:r>
+        <w:t xml:space="preserve">Mileff Péter, "Implementation of a 2D Game Engine Framework," </w:t>
+      </w:r>
+      <w:r>
+        <w:rPr>
+          <w:i/>
+          <w:iCs/>
+        </w:rPr>
+        <w:t>Acta Polytechnica Hungarica</w:t>
+      </w:r>
+      <w:r>
+        <w:t xml:space="preserve">, vol. [pótold a kötetszámot a PDF-ből], no. [pótold], pp. [pótold], 2025. [Online]. Elérhető: </w:t>
+      </w:r>
+      <w:hyperlink w:tgtFrame="_blank" w:history="1">
+        <w:r>
+          <w:rPr>
+            <w:rStyle w:val="Hyperlink"/>
+          </w:rPr>
+          <w:t>https://real.mtak.hu/229640/1/2141-Article%20Text-16829-1-10-20250816.pdf</w:t>
+        </w:r>
+      </w:hyperlink>
+      <w:r>
+        <w:t>.</w:t>
+      </w:r>
     </w:p>
     <w:p>
       <w:pPr>
@@ -12942,7 +13511,7 @@
       </w:pPr>
     </w:p>
     <w:sectPr>
-      <w:footerReference w:type="default" r:id="rId39"/>
+      <w:footerReference w:type="default" r:id="rId44"/>
       <w:pgSz w:w="11906" w:h="16838"/>
       <w:pgMar w:top="1418" w:right="1418" w:bottom="1418" w:left="1418" w:header="709" w:footer="709" w:gutter="0"/>
       <w:pgNumType w:start="1"/>
@@ -17058,7 +17627,6 @@
   <w:style w:type="character" w:default="1" w:styleId="DefaultParagraphFont">
     <w:name w:val="Default Paragraph Font"/>
     <w:uiPriority w:val="1"/>
-    <w:semiHidden/>
     <w:unhideWhenUsed/>
   </w:style>
   <w:style w:type="table" w:default="1" w:styleId="TableNormal">
@@ -17716,6 +18284,30 @@
     <w:basedOn w:val="DefaultParagraphFont"/>
     <w:rsid w:val="007817BC"/>
   </w:style>
+  <w:style w:type="character" w:styleId="UnresolvedMention">
+    <w:name w:val="Unresolved Mention"/>
+    <w:basedOn w:val="DefaultParagraphFont"/>
+    <w:uiPriority w:val="99"/>
+    <w:semiHidden/>
+    <w:unhideWhenUsed/>
+    <w:rsid w:val="002E3DC6"/>
+    <w:rPr>
+      <w:color w:val="605E5C"/>
+      <w:shd w:val="clear" w:color="auto" w:fill="E1DFDD"/>
+    </w:rPr>
+  </w:style>
+  <w:style w:type="character" w:styleId="FollowedHyperlink">
+    <w:name w:val="FollowedHyperlink"/>
+    <w:basedOn w:val="DefaultParagraphFont"/>
+    <w:uiPriority w:val="99"/>
+    <w:semiHidden/>
+    <w:unhideWhenUsed/>
+    <w:rsid w:val="00AA4057"/>
+    <w:rPr>
+      <w:color w:val="954F72" w:themeColor="followedHyperlink"/>
+      <w:u w:val="single"/>
+    </w:rPr>
+  </w:style>
 </w:styles>
 </file>
 
@@ -18019,15 +18611,6 @@
 </file>
 
 <file path=customXml/item2.xml><?xml version="1.0" encoding="utf-8"?>
-<?mso-contentType ?>
-<FormTemplates xmlns="http://schemas.microsoft.com/sharepoint/v3/contenttype/forms">
-  <Display>DocumentLibraryForm</Display>
-  <Edit>DocumentLibraryForm</Edit>
-  <New>DocumentLibraryForm</New>
-</FormTemplates>
-</file>
-
-<file path=customXml/item3.xml><?xml version="1.0" encoding="utf-8"?>
 <ct:contentTypeSchema xmlns:ct="http://schemas.microsoft.com/office/2006/metadata/contentType" xmlns:ma="http://schemas.microsoft.com/office/2006/metadata/properties/metaAttributes" ct:_="" ma:_="" ma:contentTypeName="Document" ma:contentTypeID="0x01010057D746A6CC7228419059D1F304ECB892" ma:contentTypeVersion="6" ma:contentTypeDescription="Create a new document." ma:contentTypeScope="" ma:versionID="230bd601e8ab138a3182c21189d57f93">
   <xsd:schema xmlns:xsd="http://www.w3.org/2001/XMLSchema" xmlns:xs="http://www.w3.org/2001/XMLSchema" xmlns:p="http://schemas.microsoft.com/office/2006/metadata/properties" xmlns:ns2="23369ae5-05ef-4c7c-a662-deac929baaef" targetNamespace="http://schemas.microsoft.com/office/2006/metadata/properties" ma:root="true" ma:fieldsID="ed8cacf55a6d923cbbf7f604d05b507d" ns2:_="">
     <xsd:import namespace="23369ae5-05ef-4c7c-a662-deac929baaef"/>
@@ -18185,6 +18768,15 @@
 </ct:contentTypeSchema>
 </file>
 
+<file path=customXml/item3.xml><?xml version="1.0" encoding="utf-8"?>
+<?mso-contentType ?>
+<FormTemplates xmlns="http://schemas.microsoft.com/sharepoint/v3/contenttype/forms">
+  <Display>DocumentLibraryForm</Display>
+  <Edit>DocumentLibraryForm</Edit>
+  <New>DocumentLibraryForm</New>
+</FormTemplates>
+</file>
+
 <file path=customXml/itemProps1.xml><?xml version="1.0" encoding="utf-8"?>
 <ds:datastoreItem xmlns:ds="http://schemas.openxmlformats.org/officeDocument/2006/customXml" ds:itemID="{E9F6CDE2-636C-4043-AFFC-7CB0CE5DF55A}">
   <ds:schemaRefs>
@@ -18194,14 +18786,6 @@
 </file>
 
 <file path=customXml/itemProps2.xml><?xml version="1.0" encoding="utf-8"?>
-<ds:datastoreItem xmlns:ds="http://schemas.openxmlformats.org/officeDocument/2006/customXml" ds:itemID="{79D0F40F-646A-4DBF-9119-0FC598DFBBBB}">
-  <ds:schemaRefs>
-    <ds:schemaRef ds:uri="http://schemas.microsoft.com/sharepoint/v3/contenttype/forms"/>
-  </ds:schemaRefs>
-</ds:datastoreItem>
-</file>
-
-<file path=customXml/itemProps3.xml><?xml version="1.0" encoding="utf-8"?>
 <ds:datastoreItem xmlns:ds="http://schemas.openxmlformats.org/officeDocument/2006/customXml" ds:itemID="{E0E361D0-270A-43DD-B744-DC4991A38C53}">
   <ds:schemaRefs>
     <ds:schemaRef ds:uri="http://schemas.microsoft.com/office/2006/metadata/contentType"/>
@@ -18219,6 +18803,14 @@
 </ds:datastoreItem>
 </file>
 
+<file path=customXml/itemProps3.xml><?xml version="1.0" encoding="utf-8"?>
+<ds:datastoreItem xmlns:ds="http://schemas.openxmlformats.org/officeDocument/2006/customXml" ds:itemID="{79D0F40F-646A-4DBF-9119-0FC598DFBBBB}">
+  <ds:schemaRefs>
+    <ds:schemaRef ds:uri="http://schemas.microsoft.com/sharepoint/v3/contenttype/forms"/>
+  </ds:schemaRefs>
+</ds:datastoreItem>
+</file>
+
 <file path=docMetadata/LabelInfo.xml><?xml version="1.0" encoding="utf-8"?>
 <clbl:labelList xmlns:clbl="http://schemas.microsoft.com/office/2020/mipLabelMetadata">
   <clbl:label id="{ff6dbec8-95a8-4638-9f5f-bd076536645c}" enabled="1" method="Standard" siteId="{5dbf1add-202a-4b8d-815b-bf0fb024e033}" contentBits="0" removed="0"/>

</xml_diff>